<commit_message>
Publish source-code link and refresh report
- Add 03_code/source_link.txt with the public repository URL
- Report Section 6: replace the placeholder with the live hyperlink and update the accompanying note
</commit_message>
<xml_diff>
--- a/06_report/AIassign2_Report_ConvNeXt_CIFAR10.docx
+++ b/06_report/AIassign2_Report_ConvNeXt_CIFAR10.docx
@@ -52,7 +52,6 @@
         <w:spacing w:before="360" w:after="40"/>
         <w:jc w:val="center"/>
         <w:rPr>
-          <w:rFonts w:hint="eastAsia"/>
           <w:sz w:val="24"/>
           <w:szCs w:val="24"/>
         </w:rPr>
@@ -134,7 +133,7 @@
       <w:pPr>
         <w:pStyle w:val="1"/>
       </w:pPr>
-      <w:bookmarkStart w:id="0" w:name="_Toc242556142"/>
+      <w:bookmarkStart w:id="0" w:name="_Toc242557841"/>
       <w:r>
         <w:lastRenderedPageBreak/>
         <w:t>Table of Contents</w:t>
@@ -146,6 +145,7 @@
         <w:alias w:val="Table of Contents"/>
         <w:id w:val="890004228"/>
       </w:sdtPr>
+      <w:sdtEndPr/>
       <w:sdtContent>
         <w:p>
           <w:pPr>
@@ -154,7 +154,7 @@
               <w:tab w:val="right" w:leader="dot" w:pos="9350"/>
             </w:tabs>
             <w:rPr>
-              <w:rFonts w:asciiTheme="minorHAnsi" w:hAnsiTheme="minorHAnsi" w:cstheme="minorBidi"/>
+              <w:rFonts w:asciiTheme="minorHAnsi" w:hAnsiTheme="minorHAnsi" w:cstheme="minorBidi" w:hint="eastAsia"/>
               <w:noProof/>
               <w:kern w:val="2"/>
               <w:szCs w:val="24"/>
@@ -165,15 +165,18 @@
             <w:fldChar w:fldCharType="begin"/>
           </w:r>
           <w:r>
-            <w:instrText>TOC \h \o "1-3"</w:instrText>
+            <w:instrText xml:space="preserve">TOC </w:instrText>
+          </w:r>
+          <w:r>
+            <w:instrText>\h \o "1-3"</w:instrText>
           </w:r>
           <w:r>
             <w:fldChar w:fldCharType="separate"/>
           </w:r>
-          <w:hyperlink w:anchor="_Toc242556142" w:history="1">
-            <w:r>
-              <w:rPr>
-                <w:rStyle w:val="af"/>
+          <w:hyperlink w:anchor="_Toc242557841" w:history="1">
+            <w:r>
+              <w:rPr>
+                <w:rStyle w:val="a6"/>
                 <w:rFonts w:hint="eastAsia"/>
                 <w:noProof/>
               </w:rPr>
@@ -204,7 +207,7 @@
               <w:rPr>
                 <w:noProof/>
               </w:rPr>
-              <w:instrText>PAGEREF _Toc242556142 \h</w:instrText>
+              <w:instrText>PAGEREF _Toc242557841 \h</w:instrText>
             </w:r>
             <w:r>
               <w:rPr>
@@ -221,7 +224,6 @@
             </w:r>
             <w:r>
               <w:rPr>
-                <w:rFonts w:hint="eastAsia"/>
                 <w:noProof/>
               </w:rPr>
               <w:fldChar w:fldCharType="separate"/>
@@ -248,17 +250,17 @@
               <w:tab w:val="right" w:leader="dot" w:pos="9350"/>
             </w:tabs>
             <w:rPr>
-              <w:rFonts w:asciiTheme="minorHAnsi" w:hAnsiTheme="minorHAnsi" w:cstheme="minorBidi"/>
+              <w:rFonts w:asciiTheme="minorHAnsi" w:hAnsiTheme="minorHAnsi" w:cstheme="minorBidi" w:hint="eastAsia"/>
               <w:noProof/>
               <w:kern w:val="2"/>
               <w:szCs w:val="24"/>
               <w14:ligatures w14:val="standardContextual"/>
             </w:rPr>
           </w:pPr>
-          <w:hyperlink w:anchor="_Toc242556143" w:history="1">
-            <w:r>
-              <w:rPr>
-                <w:rStyle w:val="af"/>
+          <w:hyperlink w:anchor="_Toc242557842" w:history="1">
+            <w:r>
+              <w:rPr>
+                <w:rStyle w:val="a6"/>
                 <w:rFonts w:hint="eastAsia"/>
                 <w:noProof/>
               </w:rPr>
@@ -289,7 +291,7 @@
               <w:rPr>
                 <w:noProof/>
               </w:rPr>
-              <w:instrText>PAGEREF _Toc242556143 \h</w:instrText>
+              <w:instrText>PAGEREF _Toc242557842 \h</w:instrText>
             </w:r>
             <w:r>
               <w:rPr>
@@ -306,7 +308,6 @@
             </w:r>
             <w:r>
               <w:rPr>
-                <w:rFonts w:hint="eastAsia"/>
                 <w:noProof/>
               </w:rPr>
               <w:fldChar w:fldCharType="separate"/>
@@ -334,17 +335,17 @@
             </w:tabs>
             <w:ind w:left="440"/>
             <w:rPr>
-              <w:rFonts w:asciiTheme="minorHAnsi" w:hAnsiTheme="minorHAnsi" w:cstheme="minorBidi"/>
+              <w:rFonts w:asciiTheme="minorHAnsi" w:hAnsiTheme="minorHAnsi" w:cstheme="minorBidi" w:hint="eastAsia"/>
               <w:noProof/>
               <w:kern w:val="2"/>
               <w:szCs w:val="24"/>
               <w14:ligatures w14:val="standardContextual"/>
             </w:rPr>
           </w:pPr>
-          <w:hyperlink w:anchor="_Toc242556144" w:history="1">
-            <w:r>
-              <w:rPr>
-                <w:rStyle w:val="af"/>
+          <w:hyperlink w:anchor="_Toc242557843" w:history="1">
+            <w:r>
+              <w:rPr>
+                <w:rStyle w:val="a6"/>
                 <w:rFonts w:hint="eastAsia"/>
                 <w:noProof/>
               </w:rPr>
@@ -352,7 +353,7 @@
             </w:r>
             <w:r>
               <w:rPr>
-                <w:rStyle w:val="af"/>
+                <w:rStyle w:val="a6"/>
                 <w:rFonts w:hint="eastAsia"/>
                 <w:noProof/>
               </w:rPr>
@@ -360,7 +361,7 @@
             </w:r>
             <w:r>
               <w:rPr>
-                <w:rStyle w:val="af"/>
+                <w:rStyle w:val="a6"/>
                 <w:rFonts w:hint="eastAsia"/>
                 <w:noProof/>
               </w:rPr>
@@ -391,7 +392,7 @@
               <w:rPr>
                 <w:noProof/>
               </w:rPr>
-              <w:instrText>PAGEREF _Toc242556144 \h</w:instrText>
+              <w:instrText>PAGEREF _Toc242557843 \h</w:instrText>
             </w:r>
             <w:r>
               <w:rPr>
@@ -408,7 +409,6 @@
             </w:r>
             <w:r>
               <w:rPr>
-                <w:rFonts w:hint="eastAsia"/>
                 <w:noProof/>
               </w:rPr>
               <w:fldChar w:fldCharType="separate"/>
@@ -436,17 +436,17 @@
             </w:tabs>
             <w:ind w:left="440"/>
             <w:rPr>
-              <w:rFonts w:asciiTheme="minorHAnsi" w:hAnsiTheme="minorHAnsi" w:cstheme="minorBidi"/>
+              <w:rFonts w:asciiTheme="minorHAnsi" w:hAnsiTheme="minorHAnsi" w:cstheme="minorBidi" w:hint="eastAsia"/>
               <w:noProof/>
               <w:kern w:val="2"/>
               <w:szCs w:val="24"/>
               <w14:ligatures w14:val="standardContextual"/>
             </w:rPr>
           </w:pPr>
-          <w:hyperlink w:anchor="_Toc242556145" w:history="1">
-            <w:r>
-              <w:rPr>
-                <w:rStyle w:val="af"/>
+          <w:hyperlink w:anchor="_Toc242557844" w:history="1">
+            <w:r>
+              <w:rPr>
+                <w:rStyle w:val="a6"/>
                 <w:rFonts w:hint="eastAsia"/>
                 <w:noProof/>
               </w:rPr>
@@ -454,7 +454,7 @@
             </w:r>
             <w:r>
               <w:rPr>
-                <w:rStyle w:val="af"/>
+                <w:rStyle w:val="a6"/>
                 <w:rFonts w:hint="eastAsia"/>
                 <w:noProof/>
               </w:rPr>
@@ -462,7 +462,7 @@
             </w:r>
             <w:r>
               <w:rPr>
-                <w:rStyle w:val="af"/>
+                <w:rStyle w:val="a6"/>
                 <w:rFonts w:hint="eastAsia"/>
                 <w:noProof/>
               </w:rPr>
@@ -493,7 +493,7 @@
               <w:rPr>
                 <w:noProof/>
               </w:rPr>
-              <w:instrText>PAGEREF _Toc242556145 \h</w:instrText>
+              <w:instrText>PAGEREF _Toc242557844 \h</w:instrText>
             </w:r>
             <w:r>
               <w:rPr>
@@ -510,7 +510,6 @@
             </w:r>
             <w:r>
               <w:rPr>
-                <w:rFonts w:hint="eastAsia"/>
                 <w:noProof/>
               </w:rPr>
               <w:fldChar w:fldCharType="separate"/>
@@ -538,17 +537,17 @@
             </w:tabs>
             <w:ind w:left="440"/>
             <w:rPr>
-              <w:rFonts w:asciiTheme="minorHAnsi" w:hAnsiTheme="minorHAnsi" w:cstheme="minorBidi"/>
+              <w:rFonts w:asciiTheme="minorHAnsi" w:hAnsiTheme="minorHAnsi" w:cstheme="minorBidi" w:hint="eastAsia"/>
               <w:noProof/>
               <w:kern w:val="2"/>
               <w:szCs w:val="24"/>
               <w14:ligatures w14:val="standardContextual"/>
             </w:rPr>
           </w:pPr>
-          <w:hyperlink w:anchor="_Toc242556146" w:history="1">
-            <w:r>
-              <w:rPr>
-                <w:rStyle w:val="af"/>
+          <w:hyperlink w:anchor="_Toc242557845" w:history="1">
+            <w:r>
+              <w:rPr>
+                <w:rStyle w:val="a6"/>
                 <w:rFonts w:hint="eastAsia"/>
                 <w:noProof/>
               </w:rPr>
@@ -556,7 +555,7 @@
             </w:r>
             <w:r>
               <w:rPr>
-                <w:rStyle w:val="af"/>
+                <w:rStyle w:val="a6"/>
                 <w:rFonts w:hint="eastAsia"/>
                 <w:noProof/>
               </w:rPr>
@@ -564,7 +563,7 @@
             </w:r>
             <w:r>
               <w:rPr>
-                <w:rStyle w:val="af"/>
+                <w:rStyle w:val="a6"/>
                 <w:rFonts w:hint="eastAsia"/>
                 <w:noProof/>
               </w:rPr>
@@ -595,7 +594,7 @@
               <w:rPr>
                 <w:noProof/>
               </w:rPr>
-              <w:instrText>PAGEREF _Toc242556146 \h</w:instrText>
+              <w:instrText>PAGEREF _Toc242557845 \h</w:instrText>
             </w:r>
             <w:r>
               <w:rPr>
@@ -612,7 +611,6 @@
             </w:r>
             <w:r>
               <w:rPr>
-                <w:rFonts w:hint="eastAsia"/>
                 <w:noProof/>
               </w:rPr>
               <w:fldChar w:fldCharType="separate"/>
@@ -640,17 +638,17 @@
             </w:tabs>
             <w:ind w:left="440"/>
             <w:rPr>
-              <w:rFonts w:asciiTheme="minorHAnsi" w:hAnsiTheme="minorHAnsi" w:cstheme="minorBidi"/>
+              <w:rFonts w:asciiTheme="minorHAnsi" w:hAnsiTheme="minorHAnsi" w:cstheme="minorBidi" w:hint="eastAsia"/>
               <w:noProof/>
               <w:kern w:val="2"/>
               <w:szCs w:val="24"/>
               <w14:ligatures w14:val="standardContextual"/>
             </w:rPr>
           </w:pPr>
-          <w:hyperlink w:anchor="_Toc242556147" w:history="1">
-            <w:r>
-              <w:rPr>
-                <w:rStyle w:val="af"/>
+          <w:hyperlink w:anchor="_Toc242557846" w:history="1">
+            <w:r>
+              <w:rPr>
+                <w:rStyle w:val="a6"/>
                 <w:rFonts w:hint="eastAsia"/>
                 <w:noProof/>
               </w:rPr>
@@ -658,7 +656,7 @@
             </w:r>
             <w:r>
               <w:rPr>
-                <w:rStyle w:val="af"/>
+                <w:rStyle w:val="a6"/>
                 <w:rFonts w:hint="eastAsia"/>
                 <w:noProof/>
               </w:rPr>
@@ -666,7 +664,7 @@
             </w:r>
             <w:r>
               <w:rPr>
-                <w:rStyle w:val="af"/>
+                <w:rStyle w:val="a6"/>
                 <w:rFonts w:hint="eastAsia"/>
                 <w:noProof/>
               </w:rPr>
@@ -697,7 +695,7 @@
               <w:rPr>
                 <w:noProof/>
               </w:rPr>
-              <w:instrText>PAGEREF _Toc242556147 \h</w:instrText>
+              <w:instrText>PAGEREF _Toc242557846 \h</w:instrText>
             </w:r>
             <w:r>
               <w:rPr>
@@ -714,7 +712,6 @@
             </w:r>
             <w:r>
               <w:rPr>
-                <w:rFonts w:hint="eastAsia"/>
                 <w:noProof/>
               </w:rPr>
               <w:fldChar w:fldCharType="separate"/>
@@ -742,17 +739,17 @@
             </w:tabs>
             <w:ind w:left="440"/>
             <w:rPr>
-              <w:rFonts w:asciiTheme="minorHAnsi" w:hAnsiTheme="minorHAnsi" w:cstheme="minorBidi"/>
+              <w:rFonts w:asciiTheme="minorHAnsi" w:hAnsiTheme="minorHAnsi" w:cstheme="minorBidi" w:hint="eastAsia"/>
               <w:noProof/>
               <w:kern w:val="2"/>
               <w:szCs w:val="24"/>
               <w14:ligatures w14:val="standardContextual"/>
             </w:rPr>
           </w:pPr>
-          <w:hyperlink w:anchor="_Toc242556148" w:history="1">
-            <w:r>
-              <w:rPr>
-                <w:rStyle w:val="af"/>
+          <w:hyperlink w:anchor="_Toc242557847" w:history="1">
+            <w:r>
+              <w:rPr>
+                <w:rStyle w:val="a6"/>
                 <w:rFonts w:hint="eastAsia"/>
                 <w:noProof/>
               </w:rPr>
@@ -783,7 +780,7 @@
               <w:rPr>
                 <w:noProof/>
               </w:rPr>
-              <w:instrText>PAGEREF _Toc242556148 \h</w:instrText>
+              <w:instrText>PAGEREF _Toc242557847 \h</w:instrText>
             </w:r>
             <w:r>
               <w:rPr>
@@ -800,7 +797,6 @@
             </w:r>
             <w:r>
               <w:rPr>
-                <w:rFonts w:hint="eastAsia"/>
                 <w:noProof/>
               </w:rPr>
               <w:fldChar w:fldCharType="separate"/>
@@ -827,17 +823,17 @@
               <w:tab w:val="right" w:leader="dot" w:pos="9350"/>
             </w:tabs>
             <w:rPr>
-              <w:rFonts w:asciiTheme="minorHAnsi" w:hAnsiTheme="minorHAnsi" w:cstheme="minorBidi"/>
+              <w:rFonts w:asciiTheme="minorHAnsi" w:hAnsiTheme="minorHAnsi" w:cstheme="minorBidi" w:hint="eastAsia"/>
               <w:noProof/>
               <w:kern w:val="2"/>
               <w:szCs w:val="24"/>
               <w14:ligatures w14:val="standardContextual"/>
             </w:rPr>
           </w:pPr>
-          <w:hyperlink w:anchor="_Toc242556149" w:history="1">
-            <w:r>
-              <w:rPr>
-                <w:rStyle w:val="af"/>
+          <w:hyperlink w:anchor="_Toc242557848" w:history="1">
+            <w:r>
+              <w:rPr>
+                <w:rStyle w:val="a6"/>
                 <w:rFonts w:hint="eastAsia"/>
                 <w:noProof/>
               </w:rPr>
@@ -868,7 +864,7 @@
               <w:rPr>
                 <w:noProof/>
               </w:rPr>
-              <w:instrText>PAGEREF _Toc242556149 \h</w:instrText>
+              <w:instrText>PAGEREF _Toc242557848 \h</w:instrText>
             </w:r>
             <w:r>
               <w:rPr>
@@ -885,7 +881,6 @@
             </w:r>
             <w:r>
               <w:rPr>
-                <w:rFonts w:hint="eastAsia"/>
                 <w:noProof/>
               </w:rPr>
               <w:fldChar w:fldCharType="separate"/>
@@ -913,17 +908,17 @@
             </w:tabs>
             <w:ind w:left="440"/>
             <w:rPr>
-              <w:rFonts w:asciiTheme="minorHAnsi" w:hAnsiTheme="minorHAnsi" w:cstheme="minorBidi"/>
+              <w:rFonts w:asciiTheme="minorHAnsi" w:hAnsiTheme="minorHAnsi" w:cstheme="minorBidi" w:hint="eastAsia"/>
               <w:noProof/>
               <w:kern w:val="2"/>
               <w:szCs w:val="24"/>
               <w14:ligatures w14:val="standardContextual"/>
             </w:rPr>
           </w:pPr>
-          <w:hyperlink w:anchor="_Toc242556150" w:history="1">
-            <w:r>
-              <w:rPr>
-                <w:rStyle w:val="af"/>
+          <w:hyperlink w:anchor="_Toc242557849" w:history="1">
+            <w:r>
+              <w:rPr>
+                <w:rStyle w:val="a6"/>
                 <w:rFonts w:hint="eastAsia"/>
                 <w:noProof/>
               </w:rPr>
@@ -954,7 +949,7 @@
               <w:rPr>
                 <w:noProof/>
               </w:rPr>
-              <w:instrText>PAGEREF _Toc242556150 \h</w:instrText>
+              <w:instrText>PAGEREF _Toc242557849 \h</w:instrText>
             </w:r>
             <w:r>
               <w:rPr>
@@ -971,7 +966,6 @@
             </w:r>
             <w:r>
               <w:rPr>
-                <w:rFonts w:hint="eastAsia"/>
                 <w:noProof/>
               </w:rPr>
               <w:fldChar w:fldCharType="separate"/>
@@ -999,17 +993,17 @@
             </w:tabs>
             <w:ind w:left="440"/>
             <w:rPr>
-              <w:rFonts w:asciiTheme="minorHAnsi" w:hAnsiTheme="minorHAnsi" w:cstheme="minorBidi"/>
+              <w:rFonts w:asciiTheme="minorHAnsi" w:hAnsiTheme="minorHAnsi" w:cstheme="minorBidi" w:hint="eastAsia"/>
               <w:noProof/>
               <w:kern w:val="2"/>
               <w:szCs w:val="24"/>
               <w14:ligatures w14:val="standardContextual"/>
             </w:rPr>
           </w:pPr>
-          <w:hyperlink w:anchor="_Toc242556151" w:history="1">
-            <w:r>
-              <w:rPr>
-                <w:rStyle w:val="af"/>
+          <w:hyperlink w:anchor="_Toc242557850" w:history="1">
+            <w:r>
+              <w:rPr>
+                <w:rStyle w:val="a6"/>
                 <w:rFonts w:hint="eastAsia"/>
                 <w:noProof/>
               </w:rPr>
@@ -1040,7 +1034,7 @@
               <w:rPr>
                 <w:noProof/>
               </w:rPr>
-              <w:instrText>PAGEREF _Toc242556151 \h</w:instrText>
+              <w:instrText>PAGEREF _Toc242557850 \h</w:instrText>
             </w:r>
             <w:r>
               <w:rPr>
@@ -1057,7 +1051,6 @@
             </w:r>
             <w:r>
               <w:rPr>
-                <w:rFonts w:hint="eastAsia"/>
                 <w:noProof/>
               </w:rPr>
               <w:fldChar w:fldCharType="separate"/>
@@ -1085,17 +1078,17 @@
             </w:tabs>
             <w:ind w:left="440"/>
             <w:rPr>
-              <w:rFonts w:asciiTheme="minorHAnsi" w:hAnsiTheme="minorHAnsi" w:cstheme="minorBidi"/>
+              <w:rFonts w:asciiTheme="minorHAnsi" w:hAnsiTheme="minorHAnsi" w:cstheme="minorBidi" w:hint="eastAsia"/>
               <w:noProof/>
               <w:kern w:val="2"/>
               <w:szCs w:val="24"/>
               <w14:ligatures w14:val="standardContextual"/>
             </w:rPr>
           </w:pPr>
-          <w:hyperlink w:anchor="_Toc242556152" w:history="1">
-            <w:r>
-              <w:rPr>
-                <w:rStyle w:val="af"/>
+          <w:hyperlink w:anchor="_Toc242557851" w:history="1">
+            <w:r>
+              <w:rPr>
+                <w:rStyle w:val="a6"/>
                 <w:rFonts w:hint="eastAsia"/>
                 <w:noProof/>
               </w:rPr>
@@ -1126,7 +1119,7 @@
               <w:rPr>
                 <w:noProof/>
               </w:rPr>
-              <w:instrText>PAGEREF _Toc242556152 \h</w:instrText>
+              <w:instrText>PAGEREF _Toc242557851 \h</w:instrText>
             </w:r>
             <w:r>
               <w:rPr>
@@ -1143,7 +1136,6 @@
             </w:r>
             <w:r>
               <w:rPr>
-                <w:rFonts w:hint="eastAsia"/>
                 <w:noProof/>
               </w:rPr>
               <w:fldChar w:fldCharType="separate"/>
@@ -1171,17 +1163,17 @@
             </w:tabs>
             <w:ind w:left="440"/>
             <w:rPr>
-              <w:rFonts w:asciiTheme="minorHAnsi" w:hAnsiTheme="minorHAnsi" w:cstheme="minorBidi"/>
+              <w:rFonts w:asciiTheme="minorHAnsi" w:hAnsiTheme="minorHAnsi" w:cstheme="minorBidi" w:hint="eastAsia"/>
               <w:noProof/>
               <w:kern w:val="2"/>
               <w:szCs w:val="24"/>
               <w14:ligatures w14:val="standardContextual"/>
             </w:rPr>
           </w:pPr>
-          <w:hyperlink w:anchor="_Toc242556153" w:history="1">
-            <w:r>
-              <w:rPr>
-                <w:rStyle w:val="af"/>
+          <w:hyperlink w:anchor="_Toc242557852" w:history="1">
+            <w:r>
+              <w:rPr>
+                <w:rStyle w:val="a6"/>
                 <w:rFonts w:hint="eastAsia"/>
                 <w:noProof/>
               </w:rPr>
@@ -1212,7 +1204,7 @@
               <w:rPr>
                 <w:noProof/>
               </w:rPr>
-              <w:instrText>PAGEREF _Toc242556153 \h</w:instrText>
+              <w:instrText>PAGEREF _Toc242557852 \h</w:instrText>
             </w:r>
             <w:r>
               <w:rPr>
@@ -1229,7 +1221,6 @@
             </w:r>
             <w:r>
               <w:rPr>
-                <w:rFonts w:hint="eastAsia"/>
                 <w:noProof/>
               </w:rPr>
               <w:fldChar w:fldCharType="separate"/>
@@ -1257,17 +1248,17 @@
             </w:tabs>
             <w:ind w:left="440"/>
             <w:rPr>
-              <w:rFonts w:asciiTheme="minorHAnsi" w:hAnsiTheme="minorHAnsi" w:cstheme="minorBidi"/>
+              <w:rFonts w:asciiTheme="minorHAnsi" w:hAnsiTheme="minorHAnsi" w:cstheme="minorBidi" w:hint="eastAsia"/>
               <w:noProof/>
               <w:kern w:val="2"/>
               <w:szCs w:val="24"/>
               <w14:ligatures w14:val="standardContextual"/>
             </w:rPr>
           </w:pPr>
-          <w:hyperlink w:anchor="_Toc242556154" w:history="1">
-            <w:r>
-              <w:rPr>
-                <w:rStyle w:val="af"/>
+          <w:hyperlink w:anchor="_Toc242557853" w:history="1">
+            <w:r>
+              <w:rPr>
+                <w:rStyle w:val="a6"/>
                 <w:rFonts w:hint="eastAsia"/>
                 <w:noProof/>
               </w:rPr>
@@ -1298,7 +1289,7 @@
               <w:rPr>
                 <w:noProof/>
               </w:rPr>
-              <w:instrText>PAGEREF _Toc242556154 \h</w:instrText>
+              <w:instrText>PAGEREF _Toc242557853 \h</w:instrText>
             </w:r>
             <w:r>
               <w:rPr>
@@ -1315,7 +1306,6 @@
             </w:r>
             <w:r>
               <w:rPr>
-                <w:rFonts w:hint="eastAsia"/>
                 <w:noProof/>
               </w:rPr>
               <w:fldChar w:fldCharType="separate"/>
@@ -1343,17 +1333,17 @@
             </w:tabs>
             <w:ind w:left="440"/>
             <w:rPr>
-              <w:rFonts w:asciiTheme="minorHAnsi" w:hAnsiTheme="minorHAnsi" w:cstheme="minorBidi"/>
+              <w:rFonts w:asciiTheme="minorHAnsi" w:hAnsiTheme="minorHAnsi" w:cstheme="minorBidi" w:hint="eastAsia"/>
               <w:noProof/>
               <w:kern w:val="2"/>
               <w:szCs w:val="24"/>
               <w14:ligatures w14:val="standardContextual"/>
             </w:rPr>
           </w:pPr>
-          <w:hyperlink w:anchor="_Toc242556155" w:history="1">
-            <w:r>
-              <w:rPr>
-                <w:rStyle w:val="af"/>
+          <w:hyperlink w:anchor="_Toc242557854" w:history="1">
+            <w:r>
+              <w:rPr>
+                <w:rStyle w:val="a6"/>
                 <w:rFonts w:hint="eastAsia"/>
                 <w:noProof/>
               </w:rPr>
@@ -1384,7 +1374,7 @@
               <w:rPr>
                 <w:noProof/>
               </w:rPr>
-              <w:instrText>PAGEREF _Toc242556155 \h</w:instrText>
+              <w:instrText>PAGEREF _Toc242557854 \h</w:instrText>
             </w:r>
             <w:r>
               <w:rPr>
@@ -1401,7 +1391,6 @@
             </w:r>
             <w:r>
               <w:rPr>
-                <w:rFonts w:hint="eastAsia"/>
                 <w:noProof/>
               </w:rPr>
               <w:fldChar w:fldCharType="separate"/>
@@ -1428,17 +1417,17 @@
               <w:tab w:val="right" w:leader="dot" w:pos="9350"/>
             </w:tabs>
             <w:rPr>
-              <w:rFonts w:asciiTheme="minorHAnsi" w:hAnsiTheme="minorHAnsi" w:cstheme="minorBidi"/>
+              <w:rFonts w:asciiTheme="minorHAnsi" w:hAnsiTheme="minorHAnsi" w:cstheme="minorBidi" w:hint="eastAsia"/>
               <w:noProof/>
               <w:kern w:val="2"/>
               <w:szCs w:val="24"/>
               <w14:ligatures w14:val="standardContextual"/>
             </w:rPr>
           </w:pPr>
-          <w:hyperlink w:anchor="_Toc242556156" w:history="1">
-            <w:r>
-              <w:rPr>
-                <w:rStyle w:val="af"/>
+          <w:hyperlink w:anchor="_Toc242557855" w:history="1">
+            <w:r>
+              <w:rPr>
+                <w:rStyle w:val="a6"/>
                 <w:rFonts w:hint="eastAsia"/>
                 <w:noProof/>
               </w:rPr>
@@ -1469,7 +1458,7 @@
               <w:rPr>
                 <w:noProof/>
               </w:rPr>
-              <w:instrText>PAGEREF _Toc242556156 \h</w:instrText>
+              <w:instrText>PAGEREF _Toc242557855 \h</w:instrText>
             </w:r>
             <w:r>
               <w:rPr>
@@ -1486,7 +1475,6 @@
             </w:r>
             <w:r>
               <w:rPr>
-                <w:rFonts w:hint="eastAsia"/>
                 <w:noProof/>
               </w:rPr>
               <w:fldChar w:fldCharType="separate"/>
@@ -1514,17 +1502,17 @@
             </w:tabs>
             <w:ind w:left="440"/>
             <w:rPr>
-              <w:rFonts w:asciiTheme="minorHAnsi" w:hAnsiTheme="minorHAnsi" w:cstheme="minorBidi"/>
+              <w:rFonts w:asciiTheme="minorHAnsi" w:hAnsiTheme="minorHAnsi" w:cstheme="minorBidi" w:hint="eastAsia"/>
               <w:noProof/>
               <w:kern w:val="2"/>
               <w:szCs w:val="24"/>
               <w14:ligatures w14:val="standardContextual"/>
             </w:rPr>
           </w:pPr>
-          <w:hyperlink w:anchor="_Toc242556157" w:history="1">
-            <w:r>
-              <w:rPr>
-                <w:rStyle w:val="af"/>
+          <w:hyperlink w:anchor="_Toc242557856" w:history="1">
+            <w:r>
+              <w:rPr>
+                <w:rStyle w:val="a6"/>
                 <w:rFonts w:hint="eastAsia"/>
                 <w:noProof/>
               </w:rPr>
@@ -1555,7 +1543,7 @@
               <w:rPr>
                 <w:noProof/>
               </w:rPr>
-              <w:instrText>PAGEREF _Toc242556157 \h</w:instrText>
+              <w:instrText>PAGEREF _Toc242557856 \h</w:instrText>
             </w:r>
             <w:r>
               <w:rPr>
@@ -1572,7 +1560,6 @@
             </w:r>
             <w:r>
               <w:rPr>
-                <w:rFonts w:hint="eastAsia"/>
                 <w:noProof/>
               </w:rPr>
               <w:fldChar w:fldCharType="separate"/>
@@ -1600,17 +1587,17 @@
             </w:tabs>
             <w:ind w:left="440"/>
             <w:rPr>
-              <w:rFonts w:asciiTheme="minorHAnsi" w:hAnsiTheme="minorHAnsi" w:cstheme="minorBidi"/>
+              <w:rFonts w:asciiTheme="minorHAnsi" w:hAnsiTheme="minorHAnsi" w:cstheme="minorBidi" w:hint="eastAsia"/>
               <w:noProof/>
               <w:kern w:val="2"/>
               <w:szCs w:val="24"/>
               <w14:ligatures w14:val="standardContextual"/>
             </w:rPr>
           </w:pPr>
-          <w:hyperlink w:anchor="_Toc242556158" w:history="1">
-            <w:r>
-              <w:rPr>
-                <w:rStyle w:val="af"/>
+          <w:hyperlink w:anchor="_Toc242557857" w:history="1">
+            <w:r>
+              <w:rPr>
+                <w:rStyle w:val="a6"/>
                 <w:rFonts w:hint="eastAsia"/>
                 <w:noProof/>
               </w:rPr>
@@ -1641,7 +1628,7 @@
               <w:rPr>
                 <w:noProof/>
               </w:rPr>
-              <w:instrText>PAGEREF _Toc242556158 \h</w:instrText>
+              <w:instrText>PAGEREF _Toc242557857 \h</w:instrText>
             </w:r>
             <w:r>
               <w:rPr>
@@ -1658,7 +1645,6 @@
             </w:r>
             <w:r>
               <w:rPr>
-                <w:rFonts w:hint="eastAsia"/>
                 <w:noProof/>
               </w:rPr>
               <w:fldChar w:fldCharType="separate"/>
@@ -1686,17 +1672,17 @@
             </w:tabs>
             <w:ind w:left="440"/>
             <w:rPr>
-              <w:rFonts w:asciiTheme="minorHAnsi" w:hAnsiTheme="minorHAnsi" w:cstheme="minorBidi"/>
+              <w:rFonts w:asciiTheme="minorHAnsi" w:hAnsiTheme="minorHAnsi" w:cstheme="minorBidi" w:hint="eastAsia"/>
               <w:noProof/>
               <w:kern w:val="2"/>
               <w:szCs w:val="24"/>
               <w14:ligatures w14:val="standardContextual"/>
             </w:rPr>
           </w:pPr>
-          <w:hyperlink w:anchor="_Toc242556159" w:history="1">
-            <w:r>
-              <w:rPr>
-                <w:rStyle w:val="af"/>
+          <w:hyperlink w:anchor="_Toc242557858" w:history="1">
+            <w:r>
+              <w:rPr>
+                <w:rStyle w:val="a6"/>
                 <w:rFonts w:hint="eastAsia"/>
                 <w:noProof/>
               </w:rPr>
@@ -1727,7 +1713,7 @@
               <w:rPr>
                 <w:noProof/>
               </w:rPr>
-              <w:instrText>PAGEREF _Toc242556159 \h</w:instrText>
+              <w:instrText>PAGEREF _Toc242557858 \h</w:instrText>
             </w:r>
             <w:r>
               <w:rPr>
@@ -1744,7 +1730,6 @@
             </w:r>
             <w:r>
               <w:rPr>
-                <w:rFonts w:hint="eastAsia"/>
                 <w:noProof/>
               </w:rPr>
               <w:fldChar w:fldCharType="separate"/>
@@ -1772,17 +1757,17 @@
             </w:tabs>
             <w:ind w:left="440"/>
             <w:rPr>
-              <w:rFonts w:asciiTheme="minorHAnsi" w:hAnsiTheme="minorHAnsi" w:cstheme="minorBidi"/>
+              <w:rFonts w:asciiTheme="minorHAnsi" w:hAnsiTheme="minorHAnsi" w:cstheme="minorBidi" w:hint="eastAsia"/>
               <w:noProof/>
               <w:kern w:val="2"/>
               <w:szCs w:val="24"/>
               <w14:ligatures w14:val="standardContextual"/>
             </w:rPr>
           </w:pPr>
-          <w:hyperlink w:anchor="_Toc242556160" w:history="1">
-            <w:r>
-              <w:rPr>
-                <w:rStyle w:val="af"/>
+          <w:hyperlink w:anchor="_Toc242557859" w:history="1">
+            <w:r>
+              <w:rPr>
+                <w:rStyle w:val="a6"/>
                 <w:rFonts w:hint="eastAsia"/>
                 <w:noProof/>
               </w:rPr>
@@ -1813,7 +1798,7 @@
               <w:rPr>
                 <w:noProof/>
               </w:rPr>
-              <w:instrText>PAGEREF _Toc242556160 \h</w:instrText>
+              <w:instrText>PAGEREF _Toc242557859 \h</w:instrText>
             </w:r>
             <w:r>
               <w:rPr>
@@ -1830,7 +1815,6 @@
             </w:r>
             <w:r>
               <w:rPr>
-                <w:rFonts w:hint="eastAsia"/>
                 <w:noProof/>
               </w:rPr>
               <w:fldChar w:fldCharType="separate"/>
@@ -1858,17 +1842,17 @@
             </w:tabs>
             <w:ind w:left="440"/>
             <w:rPr>
-              <w:rFonts w:asciiTheme="minorHAnsi" w:hAnsiTheme="minorHAnsi" w:cstheme="minorBidi"/>
+              <w:rFonts w:asciiTheme="minorHAnsi" w:hAnsiTheme="minorHAnsi" w:cstheme="minorBidi" w:hint="eastAsia"/>
               <w:noProof/>
               <w:kern w:val="2"/>
               <w:szCs w:val="24"/>
               <w14:ligatures w14:val="standardContextual"/>
             </w:rPr>
           </w:pPr>
-          <w:hyperlink w:anchor="_Toc242556161" w:history="1">
-            <w:r>
-              <w:rPr>
-                <w:rStyle w:val="af"/>
+          <w:hyperlink w:anchor="_Toc242557860" w:history="1">
+            <w:r>
+              <w:rPr>
+                <w:rStyle w:val="a6"/>
                 <w:rFonts w:hint="eastAsia"/>
                 <w:noProof/>
               </w:rPr>
@@ -1899,7 +1883,7 @@
               <w:rPr>
                 <w:noProof/>
               </w:rPr>
-              <w:instrText>PAGEREF _Toc242556161 \h</w:instrText>
+              <w:instrText>PAGEREF _Toc242557860 \h</w:instrText>
             </w:r>
             <w:r>
               <w:rPr>
@@ -1916,7 +1900,6 @@
             </w:r>
             <w:r>
               <w:rPr>
-                <w:rFonts w:hint="eastAsia"/>
                 <w:noProof/>
               </w:rPr>
               <w:fldChar w:fldCharType="separate"/>
@@ -1944,17 +1927,17 @@
             </w:tabs>
             <w:ind w:left="440"/>
             <w:rPr>
-              <w:rFonts w:asciiTheme="minorHAnsi" w:hAnsiTheme="minorHAnsi" w:cstheme="minorBidi"/>
+              <w:rFonts w:asciiTheme="minorHAnsi" w:hAnsiTheme="minorHAnsi" w:cstheme="minorBidi" w:hint="eastAsia"/>
               <w:noProof/>
               <w:kern w:val="2"/>
               <w:szCs w:val="24"/>
               <w14:ligatures w14:val="standardContextual"/>
             </w:rPr>
           </w:pPr>
-          <w:hyperlink w:anchor="_Toc242556162" w:history="1">
-            <w:r>
-              <w:rPr>
-                <w:rStyle w:val="af"/>
+          <w:hyperlink w:anchor="_Toc242557861" w:history="1">
+            <w:r>
+              <w:rPr>
+                <w:rStyle w:val="a6"/>
                 <w:rFonts w:hint="eastAsia"/>
                 <w:noProof/>
               </w:rPr>
@@ -1985,7 +1968,7 @@
               <w:rPr>
                 <w:noProof/>
               </w:rPr>
-              <w:instrText>PAGEREF _Toc242556162 \h</w:instrText>
+              <w:instrText>PAGEREF _Toc242557861 \h</w:instrText>
             </w:r>
             <w:r>
               <w:rPr>
@@ -2002,7 +1985,6 @@
             </w:r>
             <w:r>
               <w:rPr>
-                <w:rFonts w:hint="eastAsia"/>
                 <w:noProof/>
               </w:rPr>
               <w:fldChar w:fldCharType="separate"/>
@@ -2029,17 +2011,17 @@
               <w:tab w:val="right" w:leader="dot" w:pos="9350"/>
             </w:tabs>
             <w:rPr>
-              <w:rFonts w:asciiTheme="minorHAnsi" w:hAnsiTheme="minorHAnsi" w:cstheme="minorBidi"/>
+              <w:rFonts w:asciiTheme="minorHAnsi" w:hAnsiTheme="minorHAnsi" w:cstheme="minorBidi" w:hint="eastAsia"/>
               <w:noProof/>
               <w:kern w:val="2"/>
               <w:szCs w:val="24"/>
               <w14:ligatures w14:val="standardContextual"/>
             </w:rPr>
           </w:pPr>
-          <w:hyperlink w:anchor="_Toc242556163" w:history="1">
-            <w:r>
-              <w:rPr>
-                <w:rStyle w:val="af"/>
+          <w:hyperlink w:anchor="_Toc242557862" w:history="1">
+            <w:r>
+              <w:rPr>
+                <w:rStyle w:val="a6"/>
                 <w:rFonts w:hint="eastAsia"/>
                 <w:noProof/>
               </w:rPr>
@@ -2070,7 +2052,7 @@
               <w:rPr>
                 <w:noProof/>
               </w:rPr>
-              <w:instrText>PAGEREF _Toc242556163 \h</w:instrText>
+              <w:instrText>PAGEREF _Toc242557862 \h</w:instrText>
             </w:r>
             <w:r>
               <w:rPr>
@@ -2087,7 +2069,6 @@
             </w:r>
             <w:r>
               <w:rPr>
-                <w:rFonts w:hint="eastAsia"/>
                 <w:noProof/>
               </w:rPr>
               <w:fldChar w:fldCharType="separate"/>
@@ -2115,17 +2096,17 @@
             </w:tabs>
             <w:ind w:left="440"/>
             <w:rPr>
-              <w:rFonts w:asciiTheme="minorHAnsi" w:hAnsiTheme="minorHAnsi" w:cstheme="minorBidi"/>
+              <w:rFonts w:asciiTheme="minorHAnsi" w:hAnsiTheme="minorHAnsi" w:cstheme="minorBidi" w:hint="eastAsia"/>
               <w:noProof/>
               <w:kern w:val="2"/>
               <w:szCs w:val="24"/>
               <w14:ligatures w14:val="standardContextual"/>
             </w:rPr>
           </w:pPr>
-          <w:hyperlink w:anchor="_Toc242556164" w:history="1">
-            <w:r>
-              <w:rPr>
-                <w:rStyle w:val="af"/>
+          <w:hyperlink w:anchor="_Toc242557863" w:history="1">
+            <w:r>
+              <w:rPr>
+                <w:rStyle w:val="a6"/>
                 <w:rFonts w:hint="eastAsia"/>
                 <w:noProof/>
               </w:rPr>
@@ -2156,7 +2137,7 @@
               <w:rPr>
                 <w:noProof/>
               </w:rPr>
-              <w:instrText>PAGEREF _Toc242556164 \h</w:instrText>
+              <w:instrText>PAGEREF _Toc242557863 \h</w:instrText>
             </w:r>
             <w:r>
               <w:rPr>
@@ -2173,7 +2154,6 @@
             </w:r>
             <w:r>
               <w:rPr>
-                <w:rFonts w:hint="eastAsia"/>
                 <w:noProof/>
               </w:rPr>
               <w:fldChar w:fldCharType="separate"/>
@@ -2201,17 +2181,17 @@
             </w:tabs>
             <w:ind w:left="440"/>
             <w:rPr>
-              <w:rFonts w:asciiTheme="minorHAnsi" w:hAnsiTheme="minorHAnsi" w:cstheme="minorBidi"/>
+              <w:rFonts w:asciiTheme="minorHAnsi" w:hAnsiTheme="minorHAnsi" w:cstheme="minorBidi" w:hint="eastAsia"/>
               <w:noProof/>
               <w:kern w:val="2"/>
               <w:szCs w:val="24"/>
               <w14:ligatures w14:val="standardContextual"/>
             </w:rPr>
           </w:pPr>
-          <w:hyperlink w:anchor="_Toc242556165" w:history="1">
-            <w:r>
-              <w:rPr>
-                <w:rStyle w:val="af"/>
+          <w:hyperlink w:anchor="_Toc242557864" w:history="1">
+            <w:r>
+              <w:rPr>
+                <w:rStyle w:val="a6"/>
                 <w:rFonts w:hint="eastAsia"/>
                 <w:noProof/>
               </w:rPr>
@@ -2242,7 +2222,7 @@
               <w:rPr>
                 <w:noProof/>
               </w:rPr>
-              <w:instrText>PAGEREF _Toc242556165 \h</w:instrText>
+              <w:instrText>PAGEREF _Toc242557864 \h</w:instrText>
             </w:r>
             <w:r>
               <w:rPr>
@@ -2259,7 +2239,6 @@
             </w:r>
             <w:r>
               <w:rPr>
-                <w:rFonts w:hint="eastAsia"/>
                 <w:noProof/>
               </w:rPr>
               <w:fldChar w:fldCharType="separate"/>
@@ -2287,17 +2266,17 @@
             </w:tabs>
             <w:ind w:left="440"/>
             <w:rPr>
-              <w:rFonts w:asciiTheme="minorHAnsi" w:hAnsiTheme="minorHAnsi" w:cstheme="minorBidi"/>
+              <w:rFonts w:asciiTheme="minorHAnsi" w:hAnsiTheme="minorHAnsi" w:cstheme="minorBidi" w:hint="eastAsia"/>
               <w:noProof/>
               <w:kern w:val="2"/>
               <w:szCs w:val="24"/>
               <w14:ligatures w14:val="standardContextual"/>
             </w:rPr>
           </w:pPr>
-          <w:hyperlink w:anchor="_Toc242556166" w:history="1">
-            <w:r>
-              <w:rPr>
-                <w:rStyle w:val="af"/>
+          <w:hyperlink w:anchor="_Toc242557865" w:history="1">
+            <w:r>
+              <w:rPr>
+                <w:rStyle w:val="a6"/>
                 <w:rFonts w:hint="eastAsia"/>
                 <w:noProof/>
               </w:rPr>
@@ -2328,7 +2307,7 @@
               <w:rPr>
                 <w:noProof/>
               </w:rPr>
-              <w:instrText>PAGEREF _Toc242556166 \h</w:instrText>
+              <w:instrText>PAGEREF _Toc242557865 \h</w:instrText>
             </w:r>
             <w:r>
               <w:rPr>
@@ -2345,7 +2324,6 @@
             </w:r>
             <w:r>
               <w:rPr>
-                <w:rFonts w:hint="eastAsia"/>
                 <w:noProof/>
               </w:rPr>
               <w:fldChar w:fldCharType="separate"/>
@@ -2373,17 +2351,17 @@
             </w:tabs>
             <w:ind w:left="440"/>
             <w:rPr>
-              <w:rFonts w:asciiTheme="minorHAnsi" w:hAnsiTheme="minorHAnsi" w:cstheme="minorBidi"/>
+              <w:rFonts w:asciiTheme="minorHAnsi" w:hAnsiTheme="minorHAnsi" w:cstheme="minorBidi" w:hint="eastAsia"/>
               <w:noProof/>
               <w:kern w:val="2"/>
               <w:szCs w:val="24"/>
               <w14:ligatures w14:val="standardContextual"/>
             </w:rPr>
           </w:pPr>
-          <w:hyperlink w:anchor="_Toc242556167" w:history="1">
-            <w:r>
-              <w:rPr>
-                <w:rStyle w:val="af"/>
+          <w:hyperlink w:anchor="_Toc242557866" w:history="1">
+            <w:r>
+              <w:rPr>
+                <w:rStyle w:val="a6"/>
                 <w:rFonts w:hint="eastAsia"/>
                 <w:noProof/>
               </w:rPr>
@@ -2414,7 +2392,7 @@
               <w:rPr>
                 <w:noProof/>
               </w:rPr>
-              <w:instrText>PAGEREF _Toc242556167 \h</w:instrText>
+              <w:instrText>PAGEREF _Toc242557866 \h</w:instrText>
             </w:r>
             <w:r>
               <w:rPr>
@@ -2431,7 +2409,6 @@
             </w:r>
             <w:r>
               <w:rPr>
-                <w:rFonts w:hint="eastAsia"/>
                 <w:noProof/>
               </w:rPr>
               <w:fldChar w:fldCharType="separate"/>
@@ -2459,17 +2436,17 @@
             </w:tabs>
             <w:ind w:left="440"/>
             <w:rPr>
-              <w:rFonts w:asciiTheme="minorHAnsi" w:hAnsiTheme="minorHAnsi" w:cstheme="minorBidi"/>
+              <w:rFonts w:asciiTheme="minorHAnsi" w:hAnsiTheme="minorHAnsi" w:cstheme="minorBidi" w:hint="eastAsia"/>
               <w:noProof/>
               <w:kern w:val="2"/>
               <w:szCs w:val="24"/>
               <w14:ligatures w14:val="standardContextual"/>
             </w:rPr>
           </w:pPr>
-          <w:hyperlink w:anchor="_Toc242556168" w:history="1">
-            <w:r>
-              <w:rPr>
-                <w:rStyle w:val="af"/>
+          <w:hyperlink w:anchor="_Toc242557867" w:history="1">
+            <w:r>
+              <w:rPr>
+                <w:rStyle w:val="a6"/>
                 <w:rFonts w:hint="eastAsia"/>
                 <w:noProof/>
               </w:rPr>
@@ -2500,7 +2477,7 @@
               <w:rPr>
                 <w:noProof/>
               </w:rPr>
-              <w:instrText>PAGEREF _Toc242556168 \h</w:instrText>
+              <w:instrText>PAGEREF _Toc242557867 \h</w:instrText>
             </w:r>
             <w:r>
               <w:rPr>
@@ -2517,7 +2494,6 @@
             </w:r>
             <w:r>
               <w:rPr>
-                <w:rFonts w:hint="eastAsia"/>
                 <w:noProof/>
               </w:rPr>
               <w:fldChar w:fldCharType="separate"/>
@@ -2545,17 +2521,17 @@
             </w:tabs>
             <w:ind w:left="440"/>
             <w:rPr>
-              <w:rFonts w:asciiTheme="minorHAnsi" w:hAnsiTheme="minorHAnsi" w:cstheme="minorBidi"/>
+              <w:rFonts w:asciiTheme="minorHAnsi" w:hAnsiTheme="minorHAnsi" w:cstheme="minorBidi" w:hint="eastAsia"/>
               <w:noProof/>
               <w:kern w:val="2"/>
               <w:szCs w:val="24"/>
               <w14:ligatures w14:val="standardContextual"/>
             </w:rPr>
           </w:pPr>
-          <w:hyperlink w:anchor="_Toc242556169" w:history="1">
-            <w:r>
-              <w:rPr>
-                <w:rStyle w:val="af"/>
+          <w:hyperlink w:anchor="_Toc242557868" w:history="1">
+            <w:r>
+              <w:rPr>
+                <w:rStyle w:val="a6"/>
                 <w:rFonts w:hint="eastAsia"/>
                 <w:noProof/>
               </w:rPr>
@@ -2586,7 +2562,7 @@
               <w:rPr>
                 <w:noProof/>
               </w:rPr>
-              <w:instrText>PAGEREF _Toc242556169 \h</w:instrText>
+              <w:instrText>PAGEREF _Toc242557868 \h</w:instrText>
             </w:r>
             <w:r>
               <w:rPr>
@@ -2603,7 +2579,6 @@
             </w:r>
             <w:r>
               <w:rPr>
-                <w:rFonts w:hint="eastAsia"/>
                 <w:noProof/>
               </w:rPr>
               <w:fldChar w:fldCharType="separate"/>
@@ -2631,17 +2606,17 @@
             </w:tabs>
             <w:ind w:left="440"/>
             <w:rPr>
-              <w:rFonts w:asciiTheme="minorHAnsi" w:hAnsiTheme="minorHAnsi" w:cstheme="minorBidi"/>
+              <w:rFonts w:asciiTheme="minorHAnsi" w:hAnsiTheme="minorHAnsi" w:cstheme="minorBidi" w:hint="eastAsia"/>
               <w:noProof/>
               <w:kern w:val="2"/>
               <w:szCs w:val="24"/>
               <w14:ligatures w14:val="standardContextual"/>
             </w:rPr>
           </w:pPr>
-          <w:hyperlink w:anchor="_Toc242556170" w:history="1">
-            <w:r>
-              <w:rPr>
-                <w:rStyle w:val="af"/>
+          <w:hyperlink w:anchor="_Toc242557869" w:history="1">
+            <w:r>
+              <w:rPr>
+                <w:rStyle w:val="a6"/>
                 <w:rFonts w:hint="eastAsia"/>
                 <w:noProof/>
               </w:rPr>
@@ -2672,7 +2647,7 @@
               <w:rPr>
                 <w:noProof/>
               </w:rPr>
-              <w:instrText>PAGEREF _Toc242556170 \h</w:instrText>
+              <w:instrText>PAGEREF _Toc242557869 \h</w:instrText>
             </w:r>
             <w:r>
               <w:rPr>
@@ -2689,7 +2664,6 @@
             </w:r>
             <w:r>
               <w:rPr>
-                <w:rFonts w:hint="eastAsia"/>
                 <w:noProof/>
               </w:rPr>
               <w:fldChar w:fldCharType="separate"/>
@@ -2717,17 +2691,17 @@
             </w:tabs>
             <w:ind w:left="440"/>
             <w:rPr>
-              <w:rFonts w:asciiTheme="minorHAnsi" w:hAnsiTheme="minorHAnsi" w:cstheme="minorBidi"/>
+              <w:rFonts w:asciiTheme="minorHAnsi" w:hAnsiTheme="minorHAnsi" w:cstheme="minorBidi" w:hint="eastAsia"/>
               <w:noProof/>
               <w:kern w:val="2"/>
               <w:szCs w:val="24"/>
               <w14:ligatures w14:val="standardContextual"/>
             </w:rPr>
           </w:pPr>
-          <w:hyperlink w:anchor="_Toc242556171" w:history="1">
-            <w:r>
-              <w:rPr>
-                <w:rStyle w:val="af"/>
+          <w:hyperlink w:anchor="_Toc242557870" w:history="1">
+            <w:r>
+              <w:rPr>
+                <w:rStyle w:val="a6"/>
                 <w:rFonts w:hint="eastAsia"/>
                 <w:noProof/>
               </w:rPr>
@@ -2758,7 +2732,7 @@
               <w:rPr>
                 <w:noProof/>
               </w:rPr>
-              <w:instrText>PAGEREF _Toc242556171 \h</w:instrText>
+              <w:instrText>PAGEREF _Toc242557870 \h</w:instrText>
             </w:r>
             <w:r>
               <w:rPr>
@@ -2775,7 +2749,6 @@
             </w:r>
             <w:r>
               <w:rPr>
-                <w:rFonts w:hint="eastAsia"/>
                 <w:noProof/>
               </w:rPr>
               <w:fldChar w:fldCharType="separate"/>
@@ -2802,17 +2775,17 @@
               <w:tab w:val="right" w:leader="dot" w:pos="9350"/>
             </w:tabs>
             <w:rPr>
-              <w:rFonts w:asciiTheme="minorHAnsi" w:hAnsiTheme="minorHAnsi" w:cstheme="minorBidi"/>
+              <w:rFonts w:asciiTheme="minorHAnsi" w:hAnsiTheme="minorHAnsi" w:cstheme="minorBidi" w:hint="eastAsia"/>
               <w:noProof/>
               <w:kern w:val="2"/>
               <w:szCs w:val="24"/>
               <w14:ligatures w14:val="standardContextual"/>
             </w:rPr>
           </w:pPr>
-          <w:hyperlink w:anchor="_Toc242556172" w:history="1">
-            <w:r>
-              <w:rPr>
-                <w:rStyle w:val="af"/>
+          <w:hyperlink w:anchor="_Toc242557871" w:history="1">
+            <w:r>
+              <w:rPr>
+                <w:rStyle w:val="a6"/>
                 <w:rFonts w:hint="eastAsia"/>
                 <w:noProof/>
               </w:rPr>
@@ -2843,7 +2816,7 @@
               <w:rPr>
                 <w:noProof/>
               </w:rPr>
-              <w:instrText>PAGEREF _Toc242556172 \h</w:instrText>
+              <w:instrText>PAGEREF _Toc242557871 \h</w:instrText>
             </w:r>
             <w:r>
               <w:rPr>
@@ -2860,7 +2833,6 @@
             </w:r>
             <w:r>
               <w:rPr>
-                <w:rFonts w:hint="eastAsia"/>
                 <w:noProof/>
               </w:rPr>
               <w:fldChar w:fldCharType="separate"/>
@@ -2888,17 +2860,17 @@
             </w:tabs>
             <w:ind w:left="440"/>
             <w:rPr>
-              <w:rFonts w:asciiTheme="minorHAnsi" w:hAnsiTheme="minorHAnsi" w:cstheme="minorBidi"/>
+              <w:rFonts w:asciiTheme="minorHAnsi" w:hAnsiTheme="minorHAnsi" w:cstheme="minorBidi" w:hint="eastAsia"/>
               <w:noProof/>
               <w:kern w:val="2"/>
               <w:szCs w:val="24"/>
               <w14:ligatures w14:val="standardContextual"/>
             </w:rPr>
           </w:pPr>
-          <w:hyperlink w:anchor="_Toc242556173" w:history="1">
-            <w:r>
-              <w:rPr>
-                <w:rStyle w:val="af"/>
+          <w:hyperlink w:anchor="_Toc242557872" w:history="1">
+            <w:r>
+              <w:rPr>
+                <w:rStyle w:val="a6"/>
                 <w:rFonts w:hint="eastAsia"/>
                 <w:noProof/>
               </w:rPr>
@@ -2929,7 +2901,7 @@
               <w:rPr>
                 <w:noProof/>
               </w:rPr>
-              <w:instrText>PAGEREF _Toc242556173 \h</w:instrText>
+              <w:instrText>PAGEREF _Toc242557872 \h</w:instrText>
             </w:r>
             <w:r>
               <w:rPr>
@@ -2946,7 +2918,6 @@
             </w:r>
             <w:r>
               <w:rPr>
-                <w:rFonts w:hint="eastAsia"/>
                 <w:noProof/>
               </w:rPr>
               <w:fldChar w:fldCharType="separate"/>
@@ -2974,17 +2945,17 @@
             </w:tabs>
             <w:ind w:left="440"/>
             <w:rPr>
-              <w:rFonts w:asciiTheme="minorHAnsi" w:hAnsiTheme="minorHAnsi" w:cstheme="minorBidi"/>
+              <w:rFonts w:asciiTheme="minorHAnsi" w:hAnsiTheme="minorHAnsi" w:cstheme="minorBidi" w:hint="eastAsia"/>
               <w:noProof/>
               <w:kern w:val="2"/>
               <w:szCs w:val="24"/>
               <w14:ligatures w14:val="standardContextual"/>
             </w:rPr>
           </w:pPr>
-          <w:hyperlink w:anchor="_Toc242556174" w:history="1">
-            <w:r>
-              <w:rPr>
-                <w:rStyle w:val="af"/>
+          <w:hyperlink w:anchor="_Toc242557873" w:history="1">
+            <w:r>
+              <w:rPr>
+                <w:rStyle w:val="a6"/>
                 <w:rFonts w:hint="eastAsia"/>
                 <w:noProof/>
               </w:rPr>
@@ -3015,7 +2986,7 @@
               <w:rPr>
                 <w:noProof/>
               </w:rPr>
-              <w:instrText>PAGEREF _Toc242556174 \h</w:instrText>
+              <w:instrText>PAGEREF _Toc242557873 \h</w:instrText>
             </w:r>
             <w:r>
               <w:rPr>
@@ -3032,7 +3003,6 @@
             </w:r>
             <w:r>
               <w:rPr>
-                <w:rFonts w:hint="eastAsia"/>
                 <w:noProof/>
               </w:rPr>
               <w:fldChar w:fldCharType="separate"/>
@@ -3060,17 +3030,17 @@
             </w:tabs>
             <w:ind w:left="440"/>
             <w:rPr>
-              <w:rFonts w:asciiTheme="minorHAnsi" w:hAnsiTheme="minorHAnsi" w:cstheme="minorBidi"/>
+              <w:rFonts w:asciiTheme="minorHAnsi" w:hAnsiTheme="minorHAnsi" w:cstheme="minorBidi" w:hint="eastAsia"/>
               <w:noProof/>
               <w:kern w:val="2"/>
               <w:szCs w:val="24"/>
               <w14:ligatures w14:val="standardContextual"/>
             </w:rPr>
           </w:pPr>
-          <w:hyperlink w:anchor="_Toc242556175" w:history="1">
-            <w:r>
-              <w:rPr>
-                <w:rStyle w:val="af"/>
+          <w:hyperlink w:anchor="_Toc242557874" w:history="1">
+            <w:r>
+              <w:rPr>
+                <w:rStyle w:val="a6"/>
                 <w:rFonts w:hint="eastAsia"/>
                 <w:noProof/>
               </w:rPr>
@@ -3101,7 +3071,7 @@
               <w:rPr>
                 <w:noProof/>
               </w:rPr>
-              <w:instrText>PAGEREF _Toc242556175 \h</w:instrText>
+              <w:instrText>PAGEREF _Toc242557874 \h</w:instrText>
             </w:r>
             <w:r>
               <w:rPr>
@@ -3118,7 +3088,6 @@
             </w:r>
             <w:r>
               <w:rPr>
-                <w:rFonts w:hint="eastAsia"/>
                 <w:noProof/>
               </w:rPr>
               <w:fldChar w:fldCharType="separate"/>
@@ -3146,17 +3115,17 @@
             </w:tabs>
             <w:ind w:left="440"/>
             <w:rPr>
-              <w:rFonts w:asciiTheme="minorHAnsi" w:hAnsiTheme="minorHAnsi" w:cstheme="minorBidi"/>
+              <w:rFonts w:asciiTheme="minorHAnsi" w:hAnsiTheme="minorHAnsi" w:cstheme="minorBidi" w:hint="eastAsia"/>
               <w:noProof/>
               <w:kern w:val="2"/>
               <w:szCs w:val="24"/>
               <w14:ligatures w14:val="standardContextual"/>
             </w:rPr>
           </w:pPr>
-          <w:hyperlink w:anchor="_Toc242556176" w:history="1">
-            <w:r>
-              <w:rPr>
-                <w:rStyle w:val="af"/>
+          <w:hyperlink w:anchor="_Toc242557875" w:history="1">
+            <w:r>
+              <w:rPr>
+                <w:rStyle w:val="a6"/>
                 <w:rFonts w:hint="eastAsia"/>
                 <w:noProof/>
               </w:rPr>
@@ -3187,7 +3156,7 @@
               <w:rPr>
                 <w:noProof/>
               </w:rPr>
-              <w:instrText>PAGEREF _Toc242556176 \h</w:instrText>
+              <w:instrText>PAGEREF _Toc242557875 \h</w:instrText>
             </w:r>
             <w:r>
               <w:rPr>
@@ -3204,7 +3173,6 @@
             </w:r>
             <w:r>
               <w:rPr>
-                <w:rFonts w:hint="eastAsia"/>
                 <w:noProof/>
               </w:rPr>
               <w:fldChar w:fldCharType="separate"/>
@@ -3232,17 +3200,17 @@
             </w:tabs>
             <w:ind w:left="440"/>
             <w:rPr>
-              <w:rFonts w:asciiTheme="minorHAnsi" w:hAnsiTheme="minorHAnsi" w:cstheme="minorBidi"/>
+              <w:rFonts w:asciiTheme="minorHAnsi" w:hAnsiTheme="minorHAnsi" w:cstheme="minorBidi" w:hint="eastAsia"/>
               <w:noProof/>
               <w:kern w:val="2"/>
               <w:szCs w:val="24"/>
               <w14:ligatures w14:val="standardContextual"/>
             </w:rPr>
           </w:pPr>
-          <w:hyperlink w:anchor="_Toc242556177" w:history="1">
-            <w:r>
-              <w:rPr>
-                <w:rStyle w:val="af"/>
+          <w:hyperlink w:anchor="_Toc242557876" w:history="1">
+            <w:r>
+              <w:rPr>
+                <w:rStyle w:val="a6"/>
                 <w:rFonts w:hint="eastAsia"/>
                 <w:noProof/>
               </w:rPr>
@@ -3273,7 +3241,7 @@
               <w:rPr>
                 <w:noProof/>
               </w:rPr>
-              <w:instrText>PAGEREF _Toc242556177 \h</w:instrText>
+              <w:instrText>PAGEREF _Toc242557876 \h</w:instrText>
             </w:r>
             <w:r>
               <w:rPr>
@@ -3290,7 +3258,6 @@
             </w:r>
             <w:r>
               <w:rPr>
-                <w:rFonts w:hint="eastAsia"/>
                 <w:noProof/>
               </w:rPr>
               <w:fldChar w:fldCharType="separate"/>
@@ -3318,17 +3285,17 @@
             </w:tabs>
             <w:ind w:left="440"/>
             <w:rPr>
-              <w:rFonts w:asciiTheme="minorHAnsi" w:hAnsiTheme="minorHAnsi" w:cstheme="minorBidi"/>
+              <w:rFonts w:asciiTheme="minorHAnsi" w:hAnsiTheme="minorHAnsi" w:cstheme="minorBidi" w:hint="eastAsia"/>
               <w:noProof/>
               <w:kern w:val="2"/>
               <w:szCs w:val="24"/>
               <w14:ligatures w14:val="standardContextual"/>
             </w:rPr>
           </w:pPr>
-          <w:hyperlink w:anchor="_Toc242556178" w:history="1">
-            <w:r>
-              <w:rPr>
-                <w:rStyle w:val="af"/>
+          <w:hyperlink w:anchor="_Toc242557877" w:history="1">
+            <w:r>
+              <w:rPr>
+                <w:rStyle w:val="a6"/>
                 <w:rFonts w:hint="eastAsia"/>
                 <w:noProof/>
               </w:rPr>
@@ -3359,7 +3326,7 @@
               <w:rPr>
                 <w:noProof/>
               </w:rPr>
-              <w:instrText>PAGEREF _Toc242556178 \h</w:instrText>
+              <w:instrText>PAGEREF _Toc242557877 \h</w:instrText>
             </w:r>
             <w:r>
               <w:rPr>
@@ -3376,7 +3343,6 @@
             </w:r>
             <w:r>
               <w:rPr>
-                <w:rFonts w:hint="eastAsia"/>
                 <w:noProof/>
               </w:rPr>
               <w:fldChar w:fldCharType="separate"/>
@@ -3403,17 +3369,17 @@
               <w:tab w:val="right" w:leader="dot" w:pos="9350"/>
             </w:tabs>
             <w:rPr>
-              <w:rFonts w:asciiTheme="minorHAnsi" w:hAnsiTheme="minorHAnsi" w:cstheme="minorBidi"/>
+              <w:rFonts w:asciiTheme="minorHAnsi" w:hAnsiTheme="minorHAnsi" w:cstheme="minorBidi" w:hint="eastAsia"/>
               <w:noProof/>
               <w:kern w:val="2"/>
               <w:szCs w:val="24"/>
               <w14:ligatures w14:val="standardContextual"/>
             </w:rPr>
           </w:pPr>
-          <w:hyperlink w:anchor="_Toc242556179" w:history="1">
-            <w:r>
-              <w:rPr>
-                <w:rStyle w:val="af"/>
+          <w:hyperlink w:anchor="_Toc242557878" w:history="1">
+            <w:r>
+              <w:rPr>
+                <w:rStyle w:val="a6"/>
                 <w:rFonts w:hint="eastAsia"/>
                 <w:noProof/>
               </w:rPr>
@@ -3444,7 +3410,7 @@
               <w:rPr>
                 <w:noProof/>
               </w:rPr>
-              <w:instrText>PAGEREF _Toc242556179 \h</w:instrText>
+              <w:instrText>PAGEREF _Toc242557878 \h</w:instrText>
             </w:r>
             <w:r>
               <w:rPr>
@@ -3461,7 +3427,6 @@
             </w:r>
             <w:r>
               <w:rPr>
-                <w:rFonts w:hint="eastAsia"/>
                 <w:noProof/>
               </w:rPr>
               <w:fldChar w:fldCharType="separate"/>
@@ -3489,17 +3454,17 @@
             </w:tabs>
             <w:ind w:left="440"/>
             <w:rPr>
-              <w:rFonts w:asciiTheme="minorHAnsi" w:hAnsiTheme="minorHAnsi" w:cstheme="minorBidi"/>
+              <w:rFonts w:asciiTheme="minorHAnsi" w:hAnsiTheme="minorHAnsi" w:cstheme="minorBidi" w:hint="eastAsia"/>
               <w:noProof/>
               <w:kern w:val="2"/>
               <w:szCs w:val="24"/>
               <w14:ligatures w14:val="standardContextual"/>
             </w:rPr>
           </w:pPr>
-          <w:hyperlink w:anchor="_Toc242556180" w:history="1">
-            <w:r>
-              <w:rPr>
-                <w:rStyle w:val="af"/>
+          <w:hyperlink w:anchor="_Toc242557879" w:history="1">
+            <w:r>
+              <w:rPr>
+                <w:rStyle w:val="a6"/>
                 <w:rFonts w:hint="eastAsia"/>
                 <w:noProof/>
               </w:rPr>
@@ -3530,7 +3495,7 @@
               <w:rPr>
                 <w:noProof/>
               </w:rPr>
-              <w:instrText>PAGEREF _Toc242556180 \h</w:instrText>
+              <w:instrText>PAGEREF _Toc242557879 \h</w:instrText>
             </w:r>
             <w:r>
               <w:rPr>
@@ -3547,7 +3512,6 @@
             </w:r>
             <w:r>
               <w:rPr>
-                <w:rFonts w:hint="eastAsia"/>
                 <w:noProof/>
               </w:rPr>
               <w:fldChar w:fldCharType="separate"/>
@@ -3575,17 +3539,17 @@
             </w:tabs>
             <w:ind w:left="440"/>
             <w:rPr>
-              <w:rFonts w:asciiTheme="minorHAnsi" w:hAnsiTheme="minorHAnsi" w:cstheme="minorBidi"/>
+              <w:rFonts w:asciiTheme="minorHAnsi" w:hAnsiTheme="minorHAnsi" w:cstheme="minorBidi" w:hint="eastAsia"/>
               <w:noProof/>
               <w:kern w:val="2"/>
               <w:szCs w:val="24"/>
               <w14:ligatures w14:val="standardContextual"/>
             </w:rPr>
           </w:pPr>
-          <w:hyperlink w:anchor="_Toc242556181" w:history="1">
-            <w:r>
-              <w:rPr>
-                <w:rStyle w:val="af"/>
+          <w:hyperlink w:anchor="_Toc242557880" w:history="1">
+            <w:r>
+              <w:rPr>
+                <w:rStyle w:val="a6"/>
                 <w:rFonts w:hint="eastAsia"/>
                 <w:noProof/>
               </w:rPr>
@@ -3616,7 +3580,7 @@
               <w:rPr>
                 <w:noProof/>
               </w:rPr>
-              <w:instrText>PAGEREF _Toc242556181 \h</w:instrText>
+              <w:instrText>PAGEREF _Toc242557880 \h</w:instrText>
             </w:r>
             <w:r>
               <w:rPr>
@@ -3633,7 +3597,6 @@
             </w:r>
             <w:r>
               <w:rPr>
-                <w:rFonts w:hint="eastAsia"/>
                 <w:noProof/>
               </w:rPr>
               <w:fldChar w:fldCharType="separate"/>
@@ -3660,17 +3623,17 @@
               <w:tab w:val="right" w:leader="dot" w:pos="9350"/>
             </w:tabs>
             <w:rPr>
-              <w:rFonts w:asciiTheme="minorHAnsi" w:hAnsiTheme="minorHAnsi" w:cstheme="minorBidi"/>
+              <w:rFonts w:asciiTheme="minorHAnsi" w:hAnsiTheme="minorHAnsi" w:cstheme="minorBidi" w:hint="eastAsia"/>
               <w:noProof/>
               <w:kern w:val="2"/>
               <w:szCs w:val="24"/>
               <w14:ligatures w14:val="standardContextual"/>
             </w:rPr>
           </w:pPr>
-          <w:hyperlink w:anchor="_Toc242556182" w:history="1">
-            <w:r>
-              <w:rPr>
-                <w:rStyle w:val="af"/>
+          <w:hyperlink w:anchor="_Toc242557881" w:history="1">
+            <w:r>
+              <w:rPr>
+                <w:rStyle w:val="a6"/>
                 <w:rFonts w:hint="eastAsia"/>
                 <w:noProof/>
               </w:rPr>
@@ -3701,7 +3664,7 @@
               <w:rPr>
                 <w:noProof/>
               </w:rPr>
-              <w:instrText>PAGEREF _Toc242556182 \h</w:instrText>
+              <w:instrText>PAGEREF _Toc242557881 \h</w:instrText>
             </w:r>
             <w:r>
               <w:rPr>
@@ -3718,7 +3681,6 @@
             </w:r>
             <w:r>
               <w:rPr>
-                <w:rFonts w:hint="eastAsia"/>
                 <w:noProof/>
               </w:rPr>
               <w:fldChar w:fldCharType="separate"/>
@@ -3750,7 +3712,7 @@
         <w:pStyle w:val="1"/>
         <w:pageBreakBefore/>
       </w:pPr>
-      <w:bookmarkStart w:id="1" w:name="_Toc242556143"/>
+      <w:bookmarkStart w:id="1" w:name="_Toc242557842"/>
       <w:r>
         <w:lastRenderedPageBreak/>
         <w:t>1. How I Asked AI Tools to Find the Algorithm</w:t>
@@ -3763,14 +3725,17 @@
         <w:jc w:val="both"/>
       </w:pPr>
       <w:r>
-        <w:t>Three constraints are fixed before any modelling decision: the algorithm has to come from the Deep CNN or Deep Autoencoder family, it has to have been published between 2022 and 2026, and it has to be applied to a computer-vision or pattern-recognition task. With those in place, the AI tools were not given an open question such as “which CNN is good?”. The first task was to turn the assignment text into a checkable list of constraints, and only after that came the search for candidates that satisfy all of them.</w:t>
+        <w:t xml:space="preserve">Three constraints are fixed before any modelling decision: the algorithm has to come from the Deep CNN or Deep Autoencoder family, it has to have been published </w:t>
+      </w:r>
+      <w:r>
+        <w:t>between 2022 and 2026, and it has to be applied to a computer-vision or pattern-recognition task. With those in place, the AI tools were not given an open question such as “which CNN is good?”. The first task was to turn the assignment text into a checkable list of constraints, and only after that came the search for candidates that satisfy all of them.</w:t>
       </w:r>
     </w:p>
     <w:p>
       <w:pPr>
         <w:pStyle w:val="2"/>
       </w:pPr>
-      <w:bookmarkStart w:id="2" w:name="_Toc242556144"/>
+      <w:bookmarkStart w:id="2" w:name="_Toc242557843"/>
       <w:r>
         <w:t>1.1 Step 1 — turning the assignment into checkable constraints</w:t>
       </w:r>
@@ -3994,7 +3959,14 @@
                 <w:sz w:val="18"/>
                 <w:szCs w:val="18"/>
               </w:rPr>
-              <w:t>Model is built only from standard convolution / linear / normalisation operators — no self-attention anywhere in the code</w:t>
+              <w:t xml:space="preserve">Model is built only from standard convolution / linear / </w:t>
+            </w:r>
+            <w:r>
+              <w:rPr>
+                <w:sz w:val="18"/>
+                <w:szCs w:val="18"/>
+              </w:rPr>
+              <w:t>normalisation operators — no self-attention anywhere in the code</w:t>
             </w:r>
           </w:p>
         </w:tc>
@@ -4163,7 +4135,14 @@
                 <w:sz w:val="18"/>
                 <w:szCs w:val="18"/>
               </w:rPr>
-              <w:t>Image classification on CIFAR-10</w:t>
+              <w:t xml:space="preserve">Image </w:t>
+            </w:r>
+            <w:r>
+              <w:rPr>
+                <w:sz w:val="18"/>
+                <w:szCs w:val="18"/>
+              </w:rPr>
+              <w:t>classification on CIFAR-10</w:t>
             </w:r>
           </w:p>
         </w:tc>
@@ -4388,7 +4367,14 @@
                 <w:sz w:val="18"/>
                 <w:szCs w:val="18"/>
               </w:rPr>
-              <w:t>Report must cover the six required items</w:t>
+              <w:t xml:space="preserve">Report </w:t>
+            </w:r>
+            <w:r>
+              <w:rPr>
+                <w:sz w:val="18"/>
+                <w:szCs w:val="18"/>
+              </w:rPr>
+              <w:t>must cover the six required items</w:t>
             </w:r>
           </w:p>
         </w:tc>
@@ -4511,7 +4497,7 @@
       <w:pPr>
         <w:pStyle w:val="2"/>
       </w:pPr>
-      <w:bookmarkStart w:id="3" w:name="_Toc242556145"/>
+      <w:bookmarkStart w:id="3" w:name="_Toc242557844"/>
       <w:r>
         <w:t>1.2 Step 2 — divergent search for candidates</w:t>
       </w:r>
@@ -4523,7 +4509,10 @@
         <w:jc w:val="both"/>
       </w:pPr>
       <w:r>
-        <w:t>The second prompt asked for a shortlist of Deep-CNN and autoencoder algorithms from 2022–2026, each with its paper title, venue, a one-sentence summary of the contribution and, most importantly for this project, an honest assessment of how well it would run on limited hardware (a CPU-only laptop and a free-tier GPU). Asking for that feasibility column from the start kept out algorithms whose cost only makes sense on a large cluster.</w:t>
+        <w:t xml:space="preserve">The second prompt asked for a </w:t>
+      </w:r>
+      <w:r>
+        <w:t>shortlist of Deep-CNN and autoencoder algorithms from 2022–2026, each with its paper title, venue, a one-sentence summary of the contribution and, most importantly for this project, an honest assessment of how well it would run on limited hardware (a CPU-only laptop and a free-tier GPU). Asking for that feasibility column from the start kept out algorithms whose cost only makes sense on a large cluster.</w:t>
       </w:r>
     </w:p>
     <w:p>
@@ -5105,7 +5094,14 @@
                 <w:sz w:val="18"/>
                 <w:szCs w:val="18"/>
               </w:rPr>
-              <w:t>Low to medium — compliant with the category rule but the pretraining budget is high for a first deliverable</w:t>
+              <w:t xml:space="preserve">Low to medium — compliant with the category rule but </w:t>
+            </w:r>
+            <w:r>
+              <w:rPr>
+                <w:sz w:val="18"/>
+                <w:szCs w:val="18"/>
+              </w:rPr>
+              <w:t>the pretraining budget is high for a first deliverable</w:t>
             </w:r>
           </w:p>
         </w:tc>
@@ -5143,7 +5139,7 @@
       <w:pPr>
         <w:pStyle w:val="2"/>
       </w:pPr>
-      <w:bookmarkStart w:id="4" w:name="_Toc242556146"/>
+      <w:bookmarkStart w:id="4" w:name="_Toc242557845"/>
       <w:r>
         <w:t>1.3 Step 3 — converging on ConvNeXt</w:t>
       </w:r>
@@ -5155,15 +5151,18 @@
         <w:jc w:val="both"/>
       </w:pPr>
       <w:r>
-        <w:t>The third prompt asked the AI to rank the candidates on three axes — how well each one fits the required category, how clearly it can be implemented and how affordable it is to train — and to state what adapting it to a small-resolution dataset would cost. The reasoning behind the final choice was as follows.</w:t>
+        <w:t xml:space="preserve">The third prompt asked the AI to rank the candidates on three axes — how well each one fits the required category, how clearly it can be </w:t>
+      </w:r>
+      <w:r>
+        <w:t>implemented and how affordable it is to train — and to state what adapting it to a small-resolution dataset would cost. The reasoning behind the final choice was as follows.</w:t>
       </w:r>
     </w:p>
     <w:p>
       <w:pPr>
-        <w:pStyle w:val="ae"/>
+        <w:pStyle w:val="af"/>
         <w:numPr>
           <w:ilvl w:val="0"/>
-          <w:numId w:val="2"/>
+          <w:numId w:val="1"/>
         </w:numPr>
         <w:spacing w:after="60" w:line="264" w:lineRule="auto"/>
         <w:jc w:val="both"/>
@@ -5177,10 +5176,10 @@
     </w:p>
     <w:p>
       <w:pPr>
-        <w:pStyle w:val="ae"/>
+        <w:pStyle w:val="af"/>
         <w:numPr>
           <w:ilvl w:val="0"/>
-          <w:numId w:val="2"/>
+          <w:numId w:val="1"/>
         </w:numPr>
         <w:spacing w:after="60" w:line="264" w:lineRule="auto"/>
         <w:jc w:val="both"/>
@@ -5194,10 +5193,10 @@
     </w:p>
     <w:p>
       <w:pPr>
-        <w:pStyle w:val="ae"/>
+        <w:pStyle w:val="af"/>
         <w:numPr>
           <w:ilvl w:val="0"/>
-          <w:numId w:val="2"/>
+          <w:numId w:val="1"/>
         </w:numPr>
         <w:spacing w:after="60" w:line="264" w:lineRule="auto"/>
         <w:jc w:val="both"/>
@@ -5211,10 +5210,10 @@
     </w:p>
     <w:p>
       <w:pPr>
-        <w:pStyle w:val="ae"/>
+        <w:pStyle w:val="af"/>
         <w:numPr>
           <w:ilvl w:val="0"/>
-          <w:numId w:val="2"/>
+          <w:numId w:val="1"/>
         </w:numPr>
         <w:spacing w:after="60" w:line="264" w:lineRule="auto"/>
         <w:jc w:val="both"/>
@@ -5230,7 +5229,7 @@
       <w:pPr>
         <w:pStyle w:val="2"/>
       </w:pPr>
-      <w:bookmarkStart w:id="5" w:name="_Toc242556147"/>
+      <w:bookmarkStart w:id="5" w:name="_Toc242557846"/>
       <w:r>
         <w:t>1.4 Step 4 — verifying the provenance of the algorithm</w:t>
       </w:r>
@@ -5748,7 +5747,7 @@
       <w:pPr>
         <w:pStyle w:val="2"/>
       </w:pPr>
-      <w:bookmarkStart w:id="6" w:name="_Toc242556148"/>
+      <w:bookmarkStart w:id="6" w:name="_Toc242557847"/>
       <w:r>
         <w:t>1.5 How the prompts were structured</w:t>
       </w:r>
@@ -5760,7 +5759,13 @@
         <w:jc w:val="both"/>
       </w:pPr>
       <w:r>
-        <w:t>Every search round followed the same three-part pattern, which is why the dialogue records could later be quoted directly in this report: ask a constrained question; ask the AI to justify its answer with evidence that can be checked; and ask for the result to be saved to a file in the project archive. The five rounds are archived as the algorithm-search dialogue, the candidate list, the algorithm profile and the iteration summary. Two habits mattered most: getting the AI to argue against its own proposal, which is how the 4x4 stride-4 stem problem came to light, and insisting that every claim about the literature come with a link or identifier that can be opened and verified.</w:t>
+        <w:t xml:space="preserve">Every search round followed the same three-part pattern, which is why the dialogue records could later be </w:t>
+      </w:r>
+      <w:r>
+        <w:t>quoted directly in this report: ask a constrained question; ask the AI to justify its answer with evidence that can be checked; and ask for the result to be saved to a file in the project archive. The five rounds are archived as the algorithm-search dialogue, the candidate list, the algorithm profile and the iteration summary. Two habits mattered most: getting the AI to argue against its own proposal, which is how the 4x4 stride-4 stem problem came to light, and insisting that every claim about the literatu</w:t>
+      </w:r>
+      <w:r>
+        <w:t>re come with a link or identifier that can be opened and verified.</w:t>
       </w:r>
     </w:p>
     <w:p>
@@ -5768,7 +5773,7 @@
         <w:pStyle w:val="1"/>
         <w:pageBreakBefore/>
       </w:pPr>
-      <w:bookmarkStart w:id="7" w:name="_Toc242556149"/>
+      <w:bookmarkStart w:id="7" w:name="_Toc242557848"/>
       <w:r>
         <w:lastRenderedPageBreak/>
         <w:t>2. Algorithm Description</w:t>
@@ -5788,9 +5793,12 @@
       <w:pPr>
         <w:pStyle w:val="2"/>
       </w:pPr>
-      <w:bookmarkStart w:id="8" w:name="_Toc242556150"/>
-      <w:r>
-        <w:t>2.1 Motivation and central idea</w:t>
+      <w:bookmarkStart w:id="8" w:name="_Toc242557849"/>
+      <w:r>
+        <w:t xml:space="preserve">2.1 Motivation and </w:t>
+      </w:r>
+      <w:r>
+        <w:t>central idea</w:t>
       </w:r>
       <w:bookmarkEnd w:id="8"/>
     </w:p>
@@ -5800,14 +5808,17 @@
         <w:jc w:val="both"/>
       </w:pPr>
       <w:r>
-        <w:t>After 2020, vision transformers took over from convolutional networks as the dominant backbone, and most of the credit went to self-attention. ConvNeXt tests the opposite idea: that the gap between transformers and ConvNets is due mainly to training techniques and architectural choices that ConvNets had simply not adopted, rather than to attention itself. The authors start from a standard ResNet-50 and modernise it one step at a time, borrowing design elements from transformers (Swin Transformer in particular) and measuring the effect of each change. What comes out is a family of pure convolutional networks whose accuracy matches comparable Swin transformers, and is slightly better on detection and segmentation.</w:t>
+        <w:t>After 2020, vision transformers took over from convolutional networks as the dominant backbone, and most of the credit went to self-attention. ConvNeXt tests the opposite idea: that the gap between transformers and ConvNets is due mainly to training techniques and architectural choices that ConvNets had simply not adopted, rather than to attention itself. The authors start from a standard ResNet-50 and modernise it one step at a time, borrowing design elements from transformers (Swin Transformer in particul</w:t>
+      </w:r>
+      <w:r>
+        <w:t>ar) and measuring the effect of each change. What comes out is a family of pure convolutional networks whose accuracy matches comparable Swin transformers, and is slightly better on detection and segmentation.</w:t>
       </w:r>
     </w:p>
     <w:p>
       <w:pPr>
         <w:pStyle w:val="2"/>
       </w:pPr>
-      <w:bookmarkStart w:id="9" w:name="_Toc242556151"/>
+      <w:bookmarkStart w:id="9" w:name="_Toc242557850"/>
       <w:r>
         <w:t>2.2 The modernisation roadmap</w:t>
       </w:r>
@@ -6707,7 +6718,14 @@
                 <w:sz w:val="18"/>
                 <w:szCs w:val="18"/>
               </w:rPr>
-              <w:t>Enlarges the effective receptive field, analogous to self-attention's global mixing</w:t>
+              <w:t xml:space="preserve">Enlarges the </w:t>
+            </w:r>
+            <w:r>
+              <w:rPr>
+                <w:sz w:val="18"/>
+                <w:szCs w:val="18"/>
+              </w:rPr>
+              <w:t>effective receptive field, analogous to self-attention's global mixing</w:t>
             </w:r>
           </w:p>
         </w:tc>
@@ -6902,7 +6920,14 @@
                 <w:sz w:val="18"/>
                 <w:szCs w:val="18"/>
               </w:rPr>
-              <w:t>Micro design — normalisation</w:t>
+              <w:t xml:space="preserve">Micro design — </w:t>
+            </w:r>
+            <w:r>
+              <w:rPr>
+                <w:sz w:val="18"/>
+                <w:szCs w:val="18"/>
+              </w:rPr>
+              <w:t>normalisation</w:t>
             </w:r>
           </w:p>
         </w:tc>
@@ -7123,7 +7148,14 @@
                 <w:sz w:val="18"/>
                 <w:szCs w:val="18"/>
               </w:rPr>
-              <w:t>Decouples spatial reduction from the residual path</w:t>
+              <w:t xml:space="preserve">Decouples </w:t>
+            </w:r>
+            <w:r>
+              <w:rPr>
+                <w:sz w:val="18"/>
+                <w:szCs w:val="18"/>
+              </w:rPr>
+              <w:t>spatial reduction from the residual path</w:t>
             </w:r>
           </w:p>
         </w:tc>
@@ -7133,7 +7165,7 @@
       <w:pPr>
         <w:pStyle w:val="2"/>
       </w:pPr>
-      <w:bookmarkStart w:id="10" w:name="_Toc242556152"/>
+      <w:bookmarkStart w:id="10" w:name="_Toc242557851"/>
       <w:r>
         <w:t>2.3 The ConvNeXt block</w:t>
       </w:r>
@@ -7190,7 +7222,13 @@
           <w:rPr>
             <w:rFonts w:ascii="Cambria Math" w:hAnsi="Cambria Math"/>
           </w:rPr>
-          <m:t>y=</m:t>
+          <m:t>y</m:t>
+        </m:r>
+        <m:r>
+          <w:rPr>
+            <w:rFonts w:ascii="Cambria Math" w:hAnsi="Cambria Math"/>
+          </w:rPr>
+          <m:t>=</m:t>
         </m:r>
         <m:sSub>
           <m:sSubPr>
@@ -7221,7 +7259,19 @@
           <w:rPr>
             <w:rFonts w:ascii="Cambria Math" w:hAnsi="Cambria Math"/>
           </w:rPr>
-          <m:t>(GELU(</m:t>
+          <m:t>(</m:t>
+        </m:r>
+        <m:r>
+          <w:rPr>
+            <w:rFonts w:ascii="Cambria Math" w:hAnsi="Cambria Math"/>
+          </w:rPr>
+          <m:t>GELU</m:t>
+        </m:r>
+        <m:r>
+          <w:rPr>
+            <w:rFonts w:ascii="Cambria Math" w:hAnsi="Cambria Math"/>
+          </w:rPr>
+          <m:t>(</m:t>
         </m:r>
         <m:sSub>
           <m:sSubPr>
@@ -7252,7 +7302,19 @@
           <w:rPr>
             <w:rFonts w:ascii="Cambria Math" w:hAnsi="Cambria Math"/>
           </w:rPr>
-          <m:t>(LayerNorm(</m:t>
+          <m:t>(</m:t>
+        </m:r>
+        <m:r>
+          <w:rPr>
+            <w:rFonts w:ascii="Cambria Math" w:hAnsi="Cambria Math"/>
+          </w:rPr>
+          <m:t>LayerNorm</m:t>
+        </m:r>
+        <m:r>
+          <w:rPr>
+            <w:rFonts w:ascii="Cambria Math" w:hAnsi="Cambria Math"/>
+          </w:rPr>
+          <m:t>(</m:t>
         </m:r>
         <m:sSub>
           <m:sSubPr>
@@ -7283,7 +7345,19 @@
           <w:rPr>
             <w:rFonts w:ascii="Cambria Math" w:hAnsi="Cambria Math"/>
           </w:rPr>
-          <m:t>(x)))))</m:t>
+          <m:t>(</m:t>
+        </m:r>
+        <m:r>
+          <w:rPr>
+            <w:rFonts w:ascii="Cambria Math" w:hAnsi="Cambria Math"/>
+          </w:rPr>
+          <m:t>x</m:t>
+        </m:r>
+        <m:r>
+          <w:rPr>
+            <w:rFonts w:ascii="Cambria Math" w:hAnsi="Cambria Math"/>
+          </w:rPr>
+          <m:t>)))))</m:t>
         </m:r>
       </m:oMath>
       <w:r>
@@ -7327,7 +7401,31 @@
           <w:rPr>
             <w:rFonts w:ascii="Cambria Math" w:hAnsi="Cambria Math"/>
           </w:rPr>
-          <m:t>z=γ⋅y</m:t>
+          <m:t>z</m:t>
+        </m:r>
+        <m:r>
+          <w:rPr>
+            <w:rFonts w:ascii="Cambria Math" w:hAnsi="Cambria Math"/>
+          </w:rPr>
+          <m:t>=</m:t>
+        </m:r>
+        <m:r>
+          <w:rPr>
+            <w:rFonts w:ascii="Cambria Math" w:hAnsi="Cambria Math"/>
+          </w:rPr>
+          <m:t>γ</m:t>
+        </m:r>
+        <m:r>
+          <w:rPr>
+            <w:rFonts w:ascii="Cambria Math" w:hAnsi="Cambria Math"/>
+          </w:rPr>
+          <m:t>⋅</m:t>
+        </m:r>
+        <m:r>
+          <w:rPr>
+            <w:rFonts w:ascii="Cambria Math" w:hAnsi="Cambria Math"/>
+          </w:rPr>
+          <m:t>y</m:t>
         </m:r>
       </m:oMath>
       <w:r>
@@ -7371,7 +7469,55 @@
           <w:rPr>
             <w:rFonts w:ascii="Cambria Math" w:hAnsi="Cambria Math"/>
           </w:rPr>
-          <m:t>out=x+DropPath(z)</m:t>
+          <m:t>out</m:t>
+        </m:r>
+        <m:r>
+          <w:rPr>
+            <w:rFonts w:ascii="Cambria Math" w:hAnsi="Cambria Math"/>
+          </w:rPr>
+          <m:t>=</m:t>
+        </m:r>
+        <m:r>
+          <w:rPr>
+            <w:rFonts w:ascii="Cambria Math" w:hAnsi="Cambria Math"/>
+          </w:rPr>
+          <m:t>x</m:t>
+        </m:r>
+        <m:r>
+          <w:rPr>
+            <w:rFonts w:ascii="Cambria Math" w:hAnsi="Cambria Math"/>
+          </w:rPr>
+          <m:t>+</m:t>
+        </m:r>
+        <m:r>
+          <w:rPr>
+            <w:rFonts w:ascii="Cambria Math" w:hAnsi="Cambria Math"/>
+          </w:rPr>
+          <m:t>DropPat</m:t>
+        </m:r>
+        <m:r>
+          <w:rPr>
+            <w:rFonts w:ascii="Cambria Math" w:hAnsi="Cambria Math"/>
+          </w:rPr>
+          <m:t>h</m:t>
+        </m:r>
+        <m:r>
+          <w:rPr>
+            <w:rFonts w:ascii="Cambria Math" w:hAnsi="Cambria Math"/>
+          </w:rPr>
+          <m:t>(</m:t>
+        </m:r>
+        <m:r>
+          <w:rPr>
+            <w:rFonts w:ascii="Cambria Math" w:hAnsi="Cambria Math"/>
+          </w:rPr>
+          <m:t>z</m:t>
+        </m:r>
+        <m:r>
+          <w:rPr>
+            <w:rFonts w:ascii="Cambria Math" w:hAnsi="Cambria Math"/>
+          </w:rPr>
+          <m:t>)</m:t>
         </m:r>
       </m:oMath>
       <w:r>
@@ -7416,7 +7562,7 @@
       <w:pPr>
         <w:pStyle w:val="2"/>
       </w:pPr>
-      <w:bookmarkStart w:id="11" w:name="_Toc242556153"/>
+      <w:bookmarkStart w:id="11" w:name="_Toc242557852"/>
       <w:r>
         <w:t>2.4 Stage layout, downsampling and classifier head</w:t>
       </w:r>
@@ -7758,7 +7904,14 @@
                 <w:sz w:val="18"/>
                 <w:szCs w:val="18"/>
               </w:rPr>
-              <w:t>CPU end-to-end MVP run</w:t>
+              <w:t xml:space="preserve">CPU </w:t>
+            </w:r>
+            <w:r>
+              <w:rPr>
+                <w:sz w:val="18"/>
+                <w:szCs w:val="18"/>
+              </w:rPr>
+              <w:t>end-to-end MVP run</w:t>
             </w:r>
           </w:p>
         </w:tc>
@@ -8260,7 +8413,14 @@
                 <w:sz w:val="18"/>
                 <w:szCs w:val="18"/>
               </w:rPr>
-              <w:t>(96, 192, 384, 768)</w:t>
+              <w:t xml:space="preserve">(96, 192, </w:t>
+            </w:r>
+            <w:r>
+              <w:rPr>
+                <w:sz w:val="18"/>
+                <w:szCs w:val="18"/>
+              </w:rPr>
+              <w:t>384, 768)</w:t>
             </w:r>
           </w:p>
         </w:tc>
@@ -8326,7 +8486,7 @@
       <w:pPr>
         <w:pStyle w:val="2"/>
       </w:pPr>
-      <w:bookmarkStart w:id="12" w:name="_Toc242556154"/>
+      <w:bookmarkStart w:id="12" w:name="_Toc242557853"/>
       <w:r>
         <w:t>2.5 Adaptation to 32x32 inputs (the only structural change)</w:t>
       </w:r>
@@ -8338,14 +8498,20 @@
         <w:jc w:val="both"/>
       </w:pPr>
       <w:r>
-        <w:t>ImageNet images are 224x224, so the paper’s 4x4 stride-4 stem is a good fit there: the feature maps run 56 → 28 → 14 → 7. CIFAR-10 images are only 32x32, and the same stem would give 8 → 4 → 2 → 1, leaving 1x1 maps in the last stage and discarding most of the spatial structure. The implementation therefore uses a 3x3 stride-1 convolution as the stem, which gives 32 → 16 → 8 → 4 across the four stages. Everything else in the paper is kept as published: the (3, 3, 9, 3) stage ratio, the 4x inverted bottleneck, the 7x7 depthwise convolution, GELU, LayerNorm, the separate downsampling layers, layer scale and stochastic depth. The stem can be switched at run time (--stem-mode conv|patchify), so the original configuration is still available.</w:t>
+        <w:t xml:space="preserve">ImageNet images are 224x224, so the paper’s 4x4 stride-4 stem is a good fit there: the feature maps run 56 → 28 → 14 → 7. CIFAR-10 </w:t>
+      </w:r>
+      <w:r>
+        <w:t xml:space="preserve">images are only 32x32, and the same stem would give 8 → 4 → 2 → 1, leaving 1x1 maps in the last stage and discarding most of the spatial structure. The implementation therefore uses a 3x3 stride-1 convolution as the stem, which gives 32 → 16 → 8 → 4 across the four stages. Everything else in the paper is kept as published: the (3, 3, 9, 3) stage ratio, the 4x inverted bottleneck, the 7x7 depthwise convolution, GELU, LayerNorm, the separate downsampling layers, layer scale and stochastic depth. The stem can </w:t>
+      </w:r>
+      <w:r>
+        <w:t>be switched at run time (--stem-mode conv|patchify), so the original configuration is still available.</w:t>
       </w:r>
     </w:p>
     <w:p>
       <w:pPr>
         <w:pStyle w:val="2"/>
       </w:pPr>
-      <w:bookmarkStart w:id="13" w:name="_Toc242556155"/>
+      <w:bookmarkStart w:id="13" w:name="_Toc242557854"/>
       <w:r>
         <w:t>2.6 Training recipe and regularisation</w:t>
       </w:r>
@@ -8358,7 +8524,10 @@
       </w:pPr>
       <w:r>
         <w:lastRenderedPageBreak/>
-        <w:t>The recipe follows the paper’s training practice, adjusted for a small dataset. It uses AdamW with a base learning rate of 1e-3 and weight decay 0.05, with one-dimensional parameters (normalisation scales and offsets, and all biases) exempt from the decay; a five-epoch linear warm-up followed by cosine decay to 1e-5; label smoothing of 0.1; Mixup and CutMix on 50 % of the batches, with alpha values of 0.8 and 1.0; augmentation suited to 32x32 images rather than RandomResizedCrop, namely a random crop with 4-pixel reflect padding, a horizontal flip and random erasing with probability 0.25; stochastic depth with a maximum rate of 0.1 that grows linearly with block index; and layer scale initialised to 1e-6.</w:t>
+        <w:t>The recipe follows the paper’s training practice, adjusted for a small dataset. It uses AdamW with a base learning rate of 1e-3 and weight decay 0.05, with one-dimensional parameters (normalisation scales and offsets, and all biases) exempt from the decay; a five-epoch linear warm-up followed by cosine decay to 1e-5; label smoothing of 0.1; Mixup and CutMix on 50 % of the batches, with alpha values of 0.8 and 1.0; augmentation suited to 32x32 images rather than RandomResizedCrop, namely a random crop with 4</w:t>
+      </w:r>
+      <w:r>
+        <w:t>-pixel reflect padding, a horizontal flip and random erasing with probability 0.25; stochastic depth with a maximum rate of 0.1 that grows linearly with block index; and layer scale initialised to 1e-6.</w:t>
       </w:r>
     </w:p>
     <w:p>
@@ -8366,7 +8535,7 @@
         <w:pStyle w:val="1"/>
         <w:pageBreakBefore/>
       </w:pPr>
-      <w:bookmarkStart w:id="14" w:name="_Toc242556156"/>
+      <w:bookmarkStart w:id="14" w:name="_Toc242557855"/>
       <w:r>
         <w:lastRenderedPageBreak/>
         <w:t>3. How the AI Implemented the Algorithm</w:t>
@@ -8386,7 +8555,7 @@
       <w:pPr>
         <w:pStyle w:val="2"/>
       </w:pPr>
-      <w:bookmarkStart w:id="15" w:name="_Toc242556157"/>
+      <w:bookmarkStart w:id="15" w:name="_Toc242557856"/>
       <w:r>
         <w:t>3.1 Working protocol</w:t>
       </w:r>
@@ -8394,10 +8563,10 @@
     </w:p>
     <w:p>
       <w:pPr>
-        <w:pStyle w:val="ae"/>
+        <w:pStyle w:val="af"/>
         <w:numPr>
           <w:ilvl w:val="0"/>
-          <w:numId w:val="1"/>
+          <w:numId w:val="2"/>
         </w:numPr>
         <w:spacing w:after="60" w:line="264" w:lineRule="auto"/>
         <w:jc w:val="both"/>
@@ -8408,10 +8577,10 @@
     </w:p>
     <w:p>
       <w:pPr>
-        <w:pStyle w:val="ae"/>
+        <w:pStyle w:val="af"/>
         <w:numPr>
           <w:ilvl w:val="0"/>
-          <w:numId w:val="1"/>
+          <w:numId w:val="2"/>
         </w:numPr>
         <w:spacing w:after="60" w:line="264" w:lineRule="auto"/>
         <w:jc w:val="both"/>
@@ -8422,10 +8591,10 @@
     </w:p>
     <w:p>
       <w:pPr>
-        <w:pStyle w:val="ae"/>
+        <w:pStyle w:val="af"/>
         <w:numPr>
           <w:ilvl w:val="0"/>
-          <w:numId w:val="1"/>
+          <w:numId w:val="2"/>
         </w:numPr>
         <w:spacing w:after="60" w:line="264" w:lineRule="auto"/>
         <w:jc w:val="both"/>
@@ -8436,10 +8605,10 @@
     </w:p>
     <w:p>
       <w:pPr>
-        <w:pStyle w:val="ae"/>
+        <w:pStyle w:val="af"/>
         <w:numPr>
           <w:ilvl w:val="0"/>
-          <w:numId w:val="1"/>
+          <w:numId w:val="2"/>
         </w:numPr>
         <w:spacing w:after="60" w:line="264" w:lineRule="auto"/>
         <w:jc w:val="both"/>
@@ -8450,23 +8619,26 @@
     </w:p>
     <w:p>
       <w:pPr>
-        <w:pStyle w:val="ae"/>
+        <w:pStyle w:val="af"/>
         <w:numPr>
           <w:ilvl w:val="0"/>
-          <w:numId w:val="1"/>
+          <w:numId w:val="2"/>
         </w:numPr>
         <w:spacing w:after="60" w:line="264" w:lineRule="auto"/>
         <w:jc w:val="both"/>
       </w:pPr>
       <w:r>
-        <w:t>Record the dialogue, so that every change remains traceable to a request.</w:t>
+        <w:t xml:space="preserve">Record the dialogue, so </w:t>
+      </w:r>
+      <w:r>
+        <w:t>that every change remains traceable to a request.</w:t>
       </w:r>
     </w:p>
     <w:p>
       <w:pPr>
         <w:pStyle w:val="2"/>
       </w:pPr>
-      <w:bookmarkStart w:id="16" w:name="_Toc242556158"/>
+      <w:bookmarkStart w:id="16" w:name="_Toc242557857"/>
       <w:r>
         <w:t>3.2 Generated project structure</w:t>
       </w:r>
@@ -8672,7 +8844,14 @@
                 <w:sz w:val="18"/>
                 <w:szCs w:val="18"/>
               </w:rPr>
-              <w:t>Entry points: train-validation-test pipeline with artefact export; standalone evaluation of a saved checkpoint (with optional test-time augmentation)</w:t>
+              <w:t xml:space="preserve">Entry points: train-validation-test pipeline with artefact export; standalone evaluation of a saved </w:t>
+            </w:r>
+            <w:r>
+              <w:rPr>
+                <w:sz w:val="18"/>
+                <w:szCs w:val="18"/>
+              </w:rPr>
+              <w:t>checkpoint (with optional test-time augmentation)</w:t>
             </w:r>
           </w:p>
         </w:tc>
@@ -8786,7 +8965,14 @@
                 <w:sz w:val="18"/>
                 <w:szCs w:val="18"/>
               </w:rPr>
-              <w:t>Training loop: AdamW with parameter grouping, warm-up + cosine schedule, gradient accumulation, gradient clipping, AMP with an automatic safety net, checkpointing, resume, per-epoch metric export</w:t>
+              <w:t xml:space="preserve">Training loop: AdamW with parameter </w:t>
+            </w:r>
+            <w:r>
+              <w:rPr>
+                <w:sz w:val="18"/>
+                <w:szCs w:val="18"/>
+              </w:rPr>
+              <w:t>grouping, warm-up + cosine schedule, gradient accumulation, gradient clipping, AMP with an automatic safety net, checkpointing, resume, per-epoch metric export</w:t>
             </w:r>
           </w:p>
         </w:tc>
@@ -8958,7 +9144,14 @@
                 <w:sz w:val="18"/>
                 <w:szCs w:val="18"/>
               </w:rPr>
-              <w:t>Device selection and memory-adaptive batch-size probe, AMP compatibility layer, mixup / cutmix, CSV export, logging, seeding, visualisation, TTA</w:t>
+              <w:t xml:space="preserve">Device selection and memory-adaptive batch-size probe, AMP </w:t>
+            </w:r>
+            <w:r>
+              <w:rPr>
+                <w:sz w:val="18"/>
+                <w:szCs w:val="18"/>
+              </w:rPr>
+              <w:t>compatibility layer, mixup / cutmix, CSV export, logging, seeding, visualisation, TTA</w:t>
             </w:r>
           </w:p>
         </w:tc>
@@ -9082,7 +9275,7 @@
       <w:pPr>
         <w:pStyle w:val="2"/>
       </w:pPr>
-      <w:bookmarkStart w:id="17" w:name="_Toc242556159"/>
+      <w:bookmarkStart w:id="17" w:name="_Toc242557858"/>
       <w:r>
         <w:t>3.3 Engineering decisions worth highlighting</w:t>
       </w:r>
@@ -9090,10 +9283,10 @@
     </w:p>
     <w:p>
       <w:pPr>
-        <w:pStyle w:val="ae"/>
+        <w:pStyle w:val="af"/>
         <w:numPr>
           <w:ilvl w:val="0"/>
-          <w:numId w:val="2"/>
+          <w:numId w:val="1"/>
         </w:numPr>
         <w:spacing w:after="60" w:line="264" w:lineRule="auto"/>
         <w:jc w:val="both"/>
@@ -9114,10 +9307,10 @@
     </w:p>
     <w:p>
       <w:pPr>
-        <w:pStyle w:val="ae"/>
+        <w:pStyle w:val="af"/>
         <w:numPr>
           <w:ilvl w:val="0"/>
-          <w:numId w:val="2"/>
+          <w:numId w:val="1"/>
         </w:numPr>
         <w:spacing w:after="60" w:line="264" w:lineRule="auto"/>
         <w:jc w:val="both"/>
@@ -9126,15 +9319,21 @@
         <w:rPr>
           <w:bCs/>
         </w:rPr>
-        <w:t>Memory-adaptive batch size. Before training starts, the code runs a real forward, backward and optimiser step on the target device and adjusts the batch size until it fits, logging the measured peak. When the batch size has to be reduced, gradient accumulation makes up the difference so the effective batch stays close to the requested one. Section 4.6 describes the extra safety margin that Windows turned out to require.</w:t>
+        <w:t xml:space="preserve">Memory-adaptive batch size. Before training starts, the code runs a real forward, backward and optimiser step on the target device and adjusts the batch size until it fits, logging the measured peak. When the batch size has to be reduced, </w:t>
+      </w:r>
+      <w:r>
+        <w:rPr>
+          <w:bCs/>
+        </w:rPr>
+        <w:t>gradient accumulation makes up the difference so the effective batch stays close to the requested one. Section 4.6 describes the extra safety margin that Windows turned out to require.</w:t>
       </w:r>
     </w:p>
     <w:p>
       <w:pPr>
-        <w:pStyle w:val="ae"/>
+        <w:pStyle w:val="af"/>
         <w:numPr>
           <w:ilvl w:val="0"/>
-          <w:numId w:val="2"/>
+          <w:numId w:val="1"/>
         </w:numPr>
         <w:spacing w:after="60" w:line="264" w:lineRule="auto"/>
         <w:jc w:val="both"/>
@@ -9143,15 +9342,21 @@
         <w:rPr>
           <w:bCs/>
         </w:rPr>
-        <w:t>A compatibility and safety layer for mixed precision. The project supports both the pre-2.4 and the current PyTorch AMP APIs, prefers bfloat16 wherever the device supports it natively, records the gradient scaler’s dynamic loss scale every epoch and can fall back to full precision on its own.</w:t>
+        <w:t xml:space="preserve">A compatibility and safety layer for mixed precision. The </w:t>
+      </w:r>
+      <w:r>
+        <w:rPr>
+          <w:bCs/>
+        </w:rPr>
+        <w:t>project supports both the pre-2.4 and the current PyTorch AMP APIs, prefers bfloat16 wherever the device supports it natively, records the gradient scaler’s dynamic loss scale every epoch and can fall back to full precision on its own.</w:t>
       </w:r>
     </w:p>
     <w:p>
       <w:pPr>
-        <w:pStyle w:val="ae"/>
+        <w:pStyle w:val="af"/>
         <w:numPr>
           <w:ilvl w:val="0"/>
-          <w:numId w:val="2"/>
+          <w:numId w:val="1"/>
         </w:numPr>
         <w:spacing w:after="60" w:line="264" w:lineRule="auto"/>
         <w:jc w:val="both"/>
@@ -9165,10 +9370,10 @@
     </w:p>
     <w:p>
       <w:pPr>
-        <w:pStyle w:val="ae"/>
+        <w:pStyle w:val="af"/>
         <w:numPr>
           <w:ilvl w:val="0"/>
-          <w:numId w:val="2"/>
+          <w:numId w:val="1"/>
         </w:numPr>
         <w:spacing w:after="60" w:line="264" w:lineRule="auto"/>
         <w:jc w:val="both"/>
@@ -9184,7 +9389,7 @@
       <w:pPr>
         <w:pStyle w:val="2"/>
       </w:pPr>
-      <w:bookmarkStart w:id="18" w:name="_Toc242556160"/>
+      <w:bookmarkStart w:id="18" w:name="_Toc242557859"/>
       <w:r>
         <w:t>3.4 Verification performed on the generated code</w:t>
       </w:r>
@@ -9737,7 +9942,14 @@
                 <w:sz w:val="18"/>
                 <w:szCs w:val="18"/>
               </w:rPr>
-              <w:t>This is what exposed the failure analysed in Section 4.6</w:t>
+              <w:t xml:space="preserve">This is what </w:t>
+            </w:r>
+            <w:r>
+              <w:rPr>
+                <w:sz w:val="18"/>
+                <w:szCs w:val="18"/>
+              </w:rPr>
+              <w:t>exposed the failure analysed in Section 4.6</w:t>
             </w:r>
           </w:p>
         </w:tc>
@@ -9747,7 +9959,7 @@
       <w:pPr>
         <w:pStyle w:val="2"/>
       </w:pPr>
-      <w:bookmarkStart w:id="19" w:name="_Toc242556161"/>
+      <w:bookmarkStart w:id="19" w:name="_Toc242557860"/>
       <w:r>
         <w:t>3.5 Three engineering problems that only appeared on real hardware</w:t>
       </w:r>
@@ -9759,7 +9971,10 @@
         <w:jc w:val="both"/>
       </w:pPr>
       <w:r>
-        <w:t>The pipeline was validated on a CPU first and then moved to a GPU, where three problems surfaced that reading the code had not revealed. All three were diagnosed from the artefacts of the runs themselves and then fixed, and they are described here because documenting this kind of work is part of the assignment.</w:t>
+        <w:t xml:space="preserve">The pipeline was validated on a CPU first and then moved to a GPU, where three problems surfaced that reading the code had not </w:t>
+      </w:r>
+      <w:r>
+        <w:t>revealed. All three were diagnosed from the artefacts of the runs themselves and then fixed, and they are described here because documenting this kind of work is part of the assignment.</w:t>
       </w:r>
     </w:p>
     <w:p>
@@ -10114,7 +10329,14 @@
                 <w:sz w:val="18"/>
                 <w:szCs w:val="18"/>
               </w:rPr>
-              <w:t>Windows allows CUDA to allocate beyond physical video memory, so the probe can “pass” a batch size that does not really fit</w:t>
+              <w:t xml:space="preserve">Windows allows CUDA to allocate beyond </w:t>
+            </w:r>
+            <w:r>
+              <w:rPr>
+                <w:sz w:val="18"/>
+                <w:szCs w:val="18"/>
+              </w:rPr>
+              <w:t>physical video memory, so the probe can “pass” a batch size that does not really fit</w:t>
             </w:r>
           </w:p>
         </w:tc>
@@ -10227,7 +10449,14 @@
                 <w:sz w:val="18"/>
                 <w:szCs w:val="18"/>
               </w:rPr>
-              <w:t>PyTorch's multi-process loader moves every batch through a shared file mapping; on Windows this slowly consumes system commit charge</w:t>
+              <w:t xml:space="preserve">PyTorch's multi-process loader moves every batch through a </w:t>
+            </w:r>
+            <w:r>
+              <w:rPr>
+                <w:sz w:val="18"/>
+                <w:szCs w:val="18"/>
+              </w:rPr>
+              <w:t>shared file mapping; on Windows this slowly consumes system commit charge</w:t>
             </w:r>
           </w:p>
         </w:tc>
@@ -10265,7 +10494,7 @@
       <w:pPr>
         <w:pStyle w:val="2"/>
       </w:pPr>
-      <w:bookmarkStart w:id="20" w:name="_Toc242556162"/>
+      <w:bookmarkStart w:id="20" w:name="_Toc242557861"/>
       <w:r>
         <w:t>3.6 Reproducibility measures</w:t>
       </w:r>
@@ -10273,24 +10502,27 @@
     </w:p>
     <w:p>
       <w:pPr>
-        <w:pStyle w:val="ae"/>
+        <w:pStyle w:val="af"/>
         <w:numPr>
           <w:ilvl w:val="0"/>
-          <w:numId w:val="2"/>
+          <w:numId w:val="1"/>
         </w:numPr>
         <w:spacing w:after="60" w:line="264" w:lineRule="auto"/>
         <w:jc w:val="both"/>
       </w:pPr>
       <w:r>
-        <w:t>Fixed seeds for Python, NumPy, PyTorch and the loader workers; the training / validation split is derived from a fixed-seed permutation and archived as index files.</w:t>
+        <w:t xml:space="preserve">Fixed seeds for Python, NumPy, PyTorch and </w:t>
+      </w:r>
+      <w:r>
+        <w:t>the loader workers; the training / validation split is derived from a fixed-seed permutation and archived as index files.</w:t>
       </w:r>
     </w:p>
     <w:p>
       <w:pPr>
-        <w:pStyle w:val="ae"/>
+        <w:pStyle w:val="af"/>
         <w:numPr>
           <w:ilvl w:val="0"/>
-          <w:numId w:val="2"/>
+          <w:numId w:val="1"/>
         </w:numPr>
         <w:spacing w:after="60" w:line="264" w:lineRule="auto"/>
         <w:jc w:val="both"/>
@@ -10301,24 +10533,27 @@
     </w:p>
     <w:p>
       <w:pPr>
-        <w:pStyle w:val="ae"/>
+        <w:pStyle w:val="af"/>
         <w:numPr>
           <w:ilvl w:val="0"/>
-          <w:numId w:val="2"/>
+          <w:numId w:val="1"/>
         </w:numPr>
         <w:spacing w:after="60" w:line="264" w:lineRule="auto"/>
         <w:jc w:val="both"/>
       </w:pPr>
       <w:r>
-        <w:t>Per-epoch metrics are exported both as JSON and as a CSV with a fixed column order, so results of different experiments can be stacked into a single comparison table.</w:t>
+        <w:t xml:space="preserve">Per-epoch metrics are </w:t>
+      </w:r>
+      <w:r>
+        <w:t>exported both as JSON and as a CSV with a fixed column order, so results of different experiments can be stacked into a single comparison table.</w:t>
       </w:r>
     </w:p>
     <w:p>
       <w:pPr>
-        <w:pStyle w:val="ae"/>
+        <w:pStyle w:val="af"/>
         <w:numPr>
           <w:ilvl w:val="0"/>
-          <w:numId w:val="2"/>
+          <w:numId w:val="1"/>
         </w:numPr>
         <w:spacing w:after="60" w:line="264" w:lineRule="auto"/>
         <w:jc w:val="both"/>
@@ -10332,7 +10567,7 @@
         <w:pStyle w:val="1"/>
         <w:pageBreakBefore/>
       </w:pPr>
-      <w:bookmarkStart w:id="21" w:name="_Toc242556163"/>
+      <w:bookmarkStart w:id="21" w:name="_Toc242557862"/>
       <w:r>
         <w:lastRenderedPageBreak/>
         <w:t>4. Experiment Settings and Results</w:t>
@@ -10352,7 +10587,7 @@
       <w:pPr>
         <w:pStyle w:val="2"/>
       </w:pPr>
-      <w:bookmarkStart w:id="22" w:name="_Toc242556164"/>
+      <w:bookmarkStart w:id="22" w:name="_Toc242557863"/>
       <w:r>
         <w:t>4.1 Data</w:t>
       </w:r>
@@ -10364,14 +10599,17 @@
         <w:jc w:val="both"/>
       </w:pPr>
       <w:r>
-        <w:t>CIFAR-10 contains 60,000 32x32 RGB images in ten classes (6,000 each). The official split was followed exactly: the 50,000 training images were shuffled with a fixed seed (42) and divided into 45,000 for training and 5,000 for validation, and the official 10,000-image test set was never used for training or model selection. Augmentation was applied to the training split only; validation and test images went through a deterministic transform, namely tensor conversion and normalisation with the CIFAR-10 channel statistics (0.4914, 0.4822, 0.4465) and (0.2470, 0.2435, 0.2616).</w:t>
+        <w:t>CIFAR-10 contains 60,000 32x32 RGB images in ten classes (6,000 each). The official split was followed exactly: the 50,000 training images were shuffled with a fixed seed (42) and divided into 45,000 for training and 5,000 for validation, and the official 10,000-image test set was never used for training or model selection. Augmentation was applied to the training split only; validation and test images went through a deterministic transform, namely tensor conversion and normalisation with the CIFAR-10 chann</w:t>
+      </w:r>
+      <w:r>
+        <w:t>el statistics (0.4914, 0.4822, 0.4465) and (0.2470, 0.2435, 0.2616).</w:t>
       </w:r>
     </w:p>
     <w:p>
       <w:pPr>
         <w:pStyle w:val="2"/>
       </w:pPr>
-      <w:bookmarkStart w:id="23" w:name="_Toc242556165"/>
+      <w:bookmarkStart w:id="23" w:name="_Toc242557864"/>
       <w:r>
         <w:t>4.2 Settings of the main experiment</w:t>
       </w:r>
@@ -10697,7 +10935,14 @@
                 <w:sz w:val="18"/>
                 <w:szCs w:val="18"/>
               </w:rPr>
-              <w:t>45,000 train / 5,000 validation / 10,000 test (official test set held out)</w:t>
+              <w:t xml:space="preserve">45,000 train / 5,000 </w:t>
+            </w:r>
+            <w:r>
+              <w:rPr>
+                <w:sz w:val="18"/>
+                <w:szCs w:val="18"/>
+              </w:rPr>
+              <w:t>validation / 10,000 test (official test set held out)</w:t>
             </w:r>
           </w:p>
         </w:tc>
@@ -10811,7 +11056,14 @@
                 <w:sz w:val="18"/>
                 <w:szCs w:val="18"/>
               </w:rPr>
-              <w:t>5 epochs linear warm-up, then cosine decay to 1e-5, 60 epochs total</w:t>
+              <w:t xml:space="preserve">5 epochs linear warm-up, then cosine decay to 1e-5, 60 epochs </w:t>
+            </w:r>
+            <w:r>
+              <w:rPr>
+                <w:sz w:val="18"/>
+                <w:szCs w:val="18"/>
+              </w:rPr>
+              <w:t>total</w:t>
             </w:r>
           </w:p>
         </w:tc>
@@ -10983,7 +11235,14 @@
                 <w:sz w:val="18"/>
                 <w:szCs w:val="18"/>
               </w:rPr>
-              <w:t>Label smoothing 0.1; stochastic depth 0 → 0.1 over depth; layer-scale initialised at 1e-6; gradient clipping at norm 1.0</w:t>
+              <w:t xml:space="preserve">Label </w:t>
+            </w:r>
+            <w:r>
+              <w:rPr>
+                <w:sz w:val="18"/>
+                <w:szCs w:val="18"/>
+              </w:rPr>
+              <w:t>smoothing 0.1; stochastic depth 0 → 0.1 over depth; layer-scale initialised at 1e-6; gradient clipping at norm 1.0</w:t>
             </w:r>
           </w:p>
         </w:tc>
@@ -11163,7 +11422,7 @@
       <w:pPr>
         <w:pStyle w:val="2"/>
       </w:pPr>
-      <w:bookmarkStart w:id="24" w:name="_Toc242556166"/>
+      <w:bookmarkStart w:id="24" w:name="_Toc242557865"/>
       <w:r>
         <w:t>4.3 Main results</w:t>
       </w:r>
@@ -11175,7 +11434,10 @@
         <w:jc w:val="both"/>
       </w:pPr>
       <w:r>
-        <w:t>The checkpoint with the best validation accuracy (epoch 59, 93.50 %) was evaluated on the held-out test set twice: once with a single view and once with test-time augmentation, which averages the identity and horizontally flipped views.</w:t>
+        <w:t xml:space="preserve">The checkpoint with the best validation accuracy (epoch 59, 93.50 %) was evaluated on the held-out test set twice: once with a single view and once with test-time augmentation, which averages the identity and </w:t>
+      </w:r>
+      <w:r>
+        <w:t>horizontally flipped views.</w:t>
       </w:r>
     </w:p>
     <w:p>
@@ -11821,14 +12083,17 @@
         <w:jc w:val="both"/>
       </w:pPr>
       <w:r>
-        <w:t>For reference, random guessing across ten classes gives 10 % Top-1 and 50 % Top-5, so the trained model is 82.9 and 49.6 percentage points above chance. Test-time augmentation adds 0.21 percentage points, within the +0.2 to +0.5 range that the project’s design notes anticipated for this technique.</w:t>
+        <w:t xml:space="preserve">For reference, random guessing across ten classes gives 10 % Top-1 </w:t>
+      </w:r>
+      <w:r>
+        <w:t>and 50 % Top-5, so the trained model is 82.9 and 49.6 percentage points above chance. Test-time augmentation adds 0.21 percentage points, within the +0.2 to +0.5 range that the project’s design notes anticipated for this technique.</w:t>
       </w:r>
     </w:p>
     <w:p>
       <w:pPr>
         <w:pStyle w:val="2"/>
       </w:pPr>
-      <w:bookmarkStart w:id="25" w:name="_Toc242556167"/>
+      <w:bookmarkStart w:id="25" w:name="_Toc242557866"/>
       <w:r>
         <w:t>4.4 Training behaviour</w:t>
       </w:r>
@@ -11849,14 +12114,17 @@
         <w:jc w:val="both"/>
       </w:pPr>
       <w:r>
-        <w:t>One operational incident is worth recording, because it shows up clearly in the logs. After epoch 32 the process was killed by a Windows-specific memory error in the multi-process data loader (Section 3.5, third row). The run was resumed from the last checkpoint with --resume auto, which restored the model, the optimiser, the learning-rate schedule and the full history. Training continued from epoch 33 and the accuracy curve crossed the break without a visible step (90.70 % → 91.44 %). The only trace left behind is the per-epoch time rising from about 120 s to about 230 s, a consequence of changing the number of data-loader workers. No epoch was lost.</w:t>
+        <w:t>One operational incident is worth recording, because it shows up clearly in the logs. After epoch 32 the process was killed by a Windows-specific memory error in the multi-process data loader (Section 3.5, third row). The run was resumed from the last checkpoint with --resume auto, which restored the model, the optimiser, the learning-rate schedule and the full history. Training continued from epoch 33 and the accuracy curve crossed the break without a visible step (90.70 % → 91.44 %). The only trace left b</w:t>
+      </w:r>
+      <w:r>
+        <w:t>ehind is the per-epoch time rising from about 120 s to about 230 s, a consequence of changing the number of data-loader workers. No epoch was lost.</w:t>
       </w:r>
     </w:p>
     <w:p>
       <w:pPr>
         <w:pStyle w:val="2"/>
       </w:pPr>
-      <w:bookmarkStart w:id="26" w:name="_Toc242556168"/>
+      <w:bookmarkStart w:id="26" w:name="_Toc242557867"/>
       <w:r>
         <w:t>4.5 Per-class results and error analysis</w:t>
       </w:r>
@@ -12928,7 +13196,10 @@
         <w:jc w:val="both"/>
       </w:pPr>
       <w:r>
-        <w:t xml:space="preserve">The confusion matrix has a clear structure. The only pair confused in both directions by more than 8 % is cat ↔ dog (8.2 % of cats predicted as dogs and 8.1 % of dogs as cats), the classic fine-grained difficulty of similar fur texture and pose. Beyond that pair, the largest errors are truck → automobile (2.9 %), airplane → ship (2.2 %), bird → frog (2.2 %) and deer → frog (2.0 %). The most accurate classes — automobile, ship, frog and truck — are the ones with distinctive overall </w:t>
+        <w:t xml:space="preserve">The confusion matrix has a clear structure. The only pair confused in both directions by more than 8 % is cat ↔ dog (8.2 % of cats predicted as dogs and 8.1 % of dogs as cats), the classic </w:t>
+      </w:r>
+      <w:r>
+        <w:t xml:space="preserve">fine-grained difficulty of similar fur texture and pose. Beyond that pair, the largest errors are truck → automobile (2.9 %), airplane → ship (2.2 %), bird → frog (2.2 %) and deer → frog (2.0 %). The most accurate classes — automobile, ship, frog and truck — are the ones with distinctive overall </w:t>
       </w:r>
       <w:r>
         <w:lastRenderedPageBreak/>
@@ -12945,7 +13216,7 @@
           <w:noProof/>
         </w:rPr>
         <w:drawing>
-          <wp:inline distT="0" distB="0" distL="0" distR="0" wp14:anchorId="16B058AA" wp14:editId="064629BC">
+          <wp:inline distT="0" distB="0" distL="0" distR="0" wp14:anchorId="25D391D2" wp14:editId="408DF131">
             <wp:extent cx="5905500" cy="1714500"/>
             <wp:effectExtent l="0" t="0" r="0" b="0"/>
             <wp:docPr id="2" name="training_curves.png" descr="Figure 1. Training curves: (a) cross-entropy loss, (b) top-1 accuracy with the best epoch marked, (c) the warm-up plus cosine learning-rate schedule." title="Figure 1. Training curves: (a) cross-entropy loss, (b) top-1 accuracy with the best epoch marked, (c) the warm-up plus cosine learning-rate schedule."/>
@@ -13010,7 +13281,7 @@
           <w:noProof/>
         </w:rPr>
         <w:drawing>
-          <wp:inline distT="0" distB="0" distL="0" distR="0" wp14:anchorId="4CBBB8B5" wp14:editId="58A9E66C">
+          <wp:inline distT="0" distB="0" distL="0" distR="0" wp14:anchorId="206ABEB8" wp14:editId="3A234B1F">
             <wp:extent cx="4476750" cy="3895725"/>
             <wp:effectExtent l="0" t="0" r="0" b="0"/>
             <wp:docPr id="5" name="confusion_matrix.png" descr="Figure 2. Row-normalised confusion matrix on the test set (TTA protocol). The diagonal gives the per-class recall; the dominant off-diagonal mass is the cat/dog pair." title="Figure 2. Row-normalised confusion matrix on the test set (TTA protocol). The diagonal gives the per-class recall; the dominant off-diagonal mass is the cat/dog pair."/>
@@ -13076,7 +13347,7 @@
         </w:rPr>
         <w:lastRenderedPageBreak/>
         <w:drawing>
-          <wp:inline distT="0" distB="0" distL="0" distR="0" wp14:anchorId="08F9A1F1" wp14:editId="6BC652D2">
+          <wp:inline distT="0" distB="0" distL="0" distR="0" wp14:anchorId="7705B987" wp14:editId="31AB6502">
             <wp:extent cx="4953000" cy="2571750"/>
             <wp:effectExtent l="0" t="0" r="0" b="0"/>
             <wp:docPr id="8" name="per_class_accuracy.png" descr="Figure 3. Per-class test accuracy (TTA). The macro average is 92.87 %." title="Figure 3. Per-class test accuracy (TTA). The macro average is 92.87 %."/>
@@ -13141,7 +13412,7 @@
           <w:noProof/>
         </w:rPr>
         <w:drawing>
-          <wp:inline distT="0" distB="0" distL="0" distR="0" wp14:anchorId="32642BF0" wp14:editId="47F67486">
+          <wp:inline distT="0" distB="0" distL="0" distR="0" wp14:anchorId="174EC609" wp14:editId="4410059C">
             <wp:extent cx="5905500" cy="1609725"/>
             <wp:effectExtent l="0" t="0" r="0" b="0"/>
             <wp:docPr id="11" name="data_samples.png" descr="Figure 4. Sample images from the CIFAR-10 validation split with their labels, used to verify the download, the normalisation statistics and the augmentation pipeline." title="Figure 4. Sample images from the CIFAR-10 validation split with their labels, used to verify the download, the normalisation statistics and the augmentation pipeline."/>
@@ -13200,7 +13471,7 @@
       <w:pPr>
         <w:pStyle w:val="2"/>
       </w:pPr>
-      <w:bookmarkStart w:id="27" w:name="_Toc242556169"/>
+      <w:bookmarkStart w:id="27" w:name="_Toc242557868"/>
       <w:r>
         <w:t>4.6 Controlled comparison: the effect of numerical precision</w:t>
       </w:r>
@@ -13212,7 +13483,13 @@
         <w:jc w:val="both"/>
       </w:pPr>
       <w:r>
-        <w:t>The first full-scale attempt ran on a free GPU that supports only fp16, not bfloat16. It finished all 60 epochs without a single error message, yet the test accuracy was 25.73 % and the training loss never dropped below 2.15. Because the run’s artefacts were complete, the failure could be pinned down exactly: the gradient scaler’s dynamic loss scale had collapsed to 0.0156 (the default is 65536), and the Adam second-moment buffers of the first two stages were exactly zero, meaning those weights had never received a gradient. The cause is that layer scale initialises the residual branches with a factor of 1e-6, so the gradients in the shallow blocks are of order 1e-6; once the loss scale has collapsed, multiplying them by 0.0156 yields values below the smallest representable fp16 magnitude, and they are flushed to zero. The effective network then shrinks to the stem, the normalisation layer and the classifier head, a shallow linear model, which explains the 25 % plateau. Re-running the identical recipe with bfloat16, whose exponent range matches fp32, removes the problem entirely.</w:t>
+        <w:t xml:space="preserve">The first full-scale attempt ran on a free GPU that supports only fp16, not bfloat16. It finished all 60 epochs without a single error message, yet the test accuracy was 25.73 % </w:t>
+      </w:r>
+      <w:r>
+        <w:t xml:space="preserve">and the training loss never dropped below 2.15. Because the run’s artefacts were complete, the failure could be pinned down exactly: the gradient scaler’s dynamic loss scale had collapsed to 0.0156 (the default is 65536), and the Adam second-moment buffers of the first two stages were exactly zero, meaning those weights had never received a gradient. The cause is that layer scale initialises the residual branches with a factor of 1e-6, so the gradients in the shallow blocks are of order 1e-6; once the loss </w:t>
+      </w:r>
+      <w:r>
+        <w:t>scale has collapsed, multiplying them by 0.0156 yields values below the smallest representable fp16 magnitude, and they are flushed to zero. The effective network then shrinks to the stem, the normalisation layer and the classifier head, a shallow linear model, which explains the 25 % plateau. Re-running the identical recipe with bfloat16, whose exponent range matches fp32, removes the problem entirely.</w:t>
       </w:r>
     </w:p>
     <w:p>
@@ -13566,7 +13843,14 @@
                 <w:sz w:val="18"/>
                 <w:szCs w:val="18"/>
               </w:rPr>
-              <w:t>2.15 – 2.27 (ln 10 = 2.303)</w:t>
+              <w:t xml:space="preserve">2.15 – 2.27 (ln 10 = </w:t>
+            </w:r>
+            <w:r>
+              <w:rPr>
+                <w:sz w:val="18"/>
+                <w:szCs w:val="18"/>
+              </w:rPr>
+              <w:t>2.303)</w:t>
             </w:r>
           </w:p>
         </w:tc>
@@ -13775,14 +14059,17 @@
         <w:jc w:val="both"/>
       </w:pPr>
       <w:r>
-        <w:t>The comparison is also a methodological lesson: a run that ends without errors is not automatically a valid run. The project now records the loss scale every epoch, stores the precision metadata inside the results files and prints a clear warning whenever the scale collapses. The code goes one step further and switches to full precision automatically when that happens, and the FP32 validation run (Table 13) confirms that the recipe itself is sound.</w:t>
+        <w:t xml:space="preserve">The comparison is also a methodological lesson: a run that ends without errors is not automatically a valid run. </w:t>
+      </w:r>
+      <w:r>
+        <w:t>The project now records the loss scale every epoch, stores the precision metadata inside the results files and prints a clear warning whenever the scale collapses. The code goes one step further and switches to full precision automatically when that happens, and the FP32 validation run (Table 13) confirms that the recipe itself is sound.</w:t>
       </w:r>
     </w:p>
     <w:p>
       <w:pPr>
         <w:pStyle w:val="2"/>
       </w:pPr>
-      <w:bookmarkStart w:id="28" w:name="_Toc242556170"/>
+      <w:bookmarkStart w:id="28" w:name="_Toc242557869"/>
       <w:r>
         <w:t>4.7 CPU baseline for pipeline validation</w:t>
       </w:r>
@@ -14108,7 +14395,14 @@
                 <w:sz w:val="18"/>
                 <w:szCs w:val="18"/>
               </w:rPr>
-              <w:t>Test Top-1 45.05 %, Top-5 89.95 %, best validation 45.20 %</w:t>
+              <w:t xml:space="preserve">Test Top-1 45.05 %, Top-5 89.95 %, </w:t>
+            </w:r>
+            <w:r>
+              <w:rPr>
+                <w:sz w:val="18"/>
+                <w:szCs w:val="18"/>
+              </w:rPr>
+              <w:t>best validation 45.20 %</w:t>
             </w:r>
           </w:p>
         </w:tc>
@@ -14176,7 +14470,7 @@
       <w:pPr>
         <w:pStyle w:val="2"/>
       </w:pPr>
-      <w:bookmarkStart w:id="29" w:name="_Toc242556171"/>
+      <w:bookmarkStart w:id="29" w:name="_Toc242557870"/>
       <w:r>
         <w:t>4.8 Discussion and limitations</w:t>
       </w:r>
@@ -14184,10 +14478,10 @@
     </w:p>
     <w:p>
       <w:pPr>
-        <w:pStyle w:val="ae"/>
+        <w:pStyle w:val="af"/>
         <w:numPr>
           <w:ilvl w:val="0"/>
-          <w:numId w:val="2"/>
+          <w:numId w:val="1"/>
         </w:numPr>
         <w:spacing w:after="60" w:line="264" w:lineRule="auto"/>
         <w:jc w:val="both"/>
@@ -14196,15 +14490,21 @@
         <w:rPr>
           <w:bCs/>
         </w:rPr>
-        <w:t>Accuracy level. The test Top-1 of 92.66 % (92.87 % with TTA) falls at the lower end of the 93–95 % band that the design notes predicted for this recipe on CIFAR-10. The main reason is the limited training budget rather than the architecture: validation accuracy was still improving at epoch 59 (92.9 % at epoch 50 → 93.5 % at epoch 59), so the model had not saturated.</w:t>
+        <w:t xml:space="preserve">Accuracy level. The test Top-1 of 92.66 % (92.87 % with TTA) </w:t>
+      </w:r>
+      <w:r>
+        <w:rPr>
+          <w:bCs/>
+        </w:rPr>
+        <w:t>falls at the lower end of the 93–95 % band that the design notes predicted for this recipe on CIFAR-10. The main reason is the limited training budget rather than the architecture: validation accuracy was still improving at epoch 59 (92.9 % at epoch 50 → 93.5 % at epoch 59), so the model had not saturated.</w:t>
       </w:r>
     </w:p>
     <w:p>
       <w:pPr>
-        <w:pStyle w:val="ae"/>
+        <w:pStyle w:val="af"/>
         <w:numPr>
           <w:ilvl w:val="0"/>
-          <w:numId w:val="2"/>
+          <w:numId w:val="1"/>
         </w:numPr>
         <w:spacing w:after="60" w:line="264" w:lineRule="auto"/>
         <w:jc w:val="both"/>
@@ -14218,10 +14518,10 @@
     </w:p>
     <w:p>
       <w:pPr>
-        <w:pStyle w:val="ae"/>
+        <w:pStyle w:val="af"/>
         <w:numPr>
           <w:ilvl w:val="0"/>
-          <w:numId w:val="2"/>
+          <w:numId w:val="1"/>
         </w:numPr>
         <w:spacing w:after="60" w:line="264" w:lineRule="auto"/>
         <w:jc w:val="both"/>
@@ -14235,10 +14535,10 @@
     </w:p>
     <w:p>
       <w:pPr>
-        <w:pStyle w:val="ae"/>
+        <w:pStyle w:val="af"/>
         <w:numPr>
           <w:ilvl w:val="0"/>
-          <w:numId w:val="2"/>
+          <w:numId w:val="1"/>
         </w:numPr>
         <w:spacing w:after="60" w:line="264" w:lineRule="auto"/>
         <w:jc w:val="both"/>
@@ -14247,7 +14547,13 @@
         <w:rPr>
           <w:bCs/>
         </w:rPr>
-        <w:t>Suggested follow-ups, in decreasing order of expected benefit. (1) Train for longer, 120 to 300 epochs, since the curve had not saturated. (2) Repeat with three seeds and report the mean and standard deviation. (3) Add RandAugment, which the code already supports through a configuration switch. (4) Run the structural ablations the project is already set up for, such as patchify stem versus 3x3 stem and the atto, pico and tiny presets. (5) Compare against a transformer baseline under identical settings to test the paper’s central claim on this dataset.</w:t>
+        <w:t>Suggested follow-ups, in decreasing order of expected benefit. (1) Train for longer, 120 to 300 epochs, since the curve had not saturated. (2) Repeat with three seeds and report the mean and standard deviation. (3) Add RandAugment, which the code already supports through a configuration switch. (4) Run the structural ablations the project is already set up for, such as patchify stem versus 3x3 stem and the atto, pico and tiny presets. (5) Compare against a transformer baseline under identical settings to te</w:t>
+      </w:r>
+      <w:r>
+        <w:rPr>
+          <w:bCs/>
+        </w:rPr>
+        <w:t>st the paper’s central claim on this dataset.</w:t>
       </w:r>
     </w:p>
     <w:p>
@@ -14255,7 +14561,7 @@
         <w:pStyle w:val="1"/>
         <w:pageBreakBefore/>
       </w:pPr>
-      <w:bookmarkStart w:id="30" w:name="_Toc242556172"/>
+      <w:bookmarkStart w:id="30" w:name="_Toc242557871"/>
       <w:r>
         <w:lastRenderedPageBreak/>
         <w:t>5. What I Have Learnt from This AI Assignment</w:t>
@@ -14266,7 +14572,7 @@
       <w:pPr>
         <w:pStyle w:val="2"/>
       </w:pPr>
-      <w:bookmarkStart w:id="31" w:name="_Toc242556173"/>
+      <w:bookmarkStart w:id="31" w:name="_Toc242557872"/>
       <w:r>
         <w:t>5.1 An AI agent can own the entire pipeline, but verification remains the human contribution</w:t>
       </w:r>
@@ -14278,14 +14584,17 @@
         <w:jc w:val="both"/>
       </w:pPr>
       <w:r>
-        <w:t>The agent wrote the model, the training loop, the evaluation, the plotting code, the Colab notebook generator, the download accelerator and the documentation, roughly 2,600 lines across 24 files, and none of it was hand-written. What it could not do on its own was decide whether the artefacts it produced were trustworthy. My most valuable contributions were procedural: insisting that every run write its configuration and per-epoch metrics to disk, that all reported numbers come from the same evaluation protocol, and that no claim be accepted until a measurement backs it. The fp16 incident is the clearest example. The code was correct and the logs showed no error, yet the result was worthless, and only the archived checkpoint made that visible.</w:t>
+        <w:t>The agent wrote the model, the training loop, the evaluation, the plotting code, the Colab notebook generator, the download accelerator and the documentation, roughly 2,600 lines across 24 files, and none of it was hand-written. What it could not do on its own was decide whether the artefacts it produced were trustworthy. My most valuable contributions were procedural: insisting that every run write its configuration and per-epoch metrics to disk, that all reported numbers come from the same evaluation prot</w:t>
+      </w:r>
+      <w:r>
+        <w:t>ocol, and that no claim be accepted until a measurement backs it. The fp16 incident is the clearest example. The code was correct and the logs showed no error, yet the result was worthless, and only the archived checkpoint made that visible.</w:t>
       </w:r>
     </w:p>
     <w:p>
       <w:pPr>
         <w:pStyle w:val="2"/>
       </w:pPr>
-      <w:bookmarkStart w:id="32" w:name="_Toc242556174"/>
+      <w:bookmarkStart w:id="32" w:name="_Toc242557873"/>
       <w:r>
         <w:t>5.2 Numerical precision is an engineering problem, not a detail</w:t>
       </w:r>
@@ -14297,14 +14606,17 @@
         <w:jc w:val="both"/>
       </w:pPr>
       <w:r>
-        <w:t>I had assumed that mixed precision was purely a speed optimisation. In fact 16-bit arithmetic can quietly destroy a training run: because layer scale multiplies each residual branch by 1e-6, the shallow blocks have very small gradients, and once the gradient scaler’s dynamic loss scale collapsed, those gradients underflowed to exactly zero. The lesson is general: whenever a network contains very small multiplicative constants, bfloat16 (or full precision) is the safe default, and the loss scale should be logged and watched rather than assumed to be healthy.</w:t>
+        <w:t>I had assumed that mixed precision was purely a speed optimisation. In fact 16-bit arithmetic can quietly destroy a training run: because layer scale multiplies each residual branch by 1e-6, the shallow blocks have very small gradients, and once the gradient scaler’s dynamic loss scale collapsed, those gradients underflowed to exactly zero. The lesson is general: whenever a network contains very small multiplicative constants, bfloat16 (or full precision) is the safe default, and the loss scale should be lo</w:t>
+      </w:r>
+      <w:r>
+        <w:t>gged and watched rather than assumed to be healthy.</w:t>
       </w:r>
     </w:p>
     <w:p>
       <w:pPr>
         <w:pStyle w:val="2"/>
       </w:pPr>
-      <w:bookmarkStart w:id="33" w:name="_Toc242556175"/>
+      <w:bookmarkStart w:id="33" w:name="_Toc242557874"/>
       <w:r>
         <w:t>5.3 Platform behaviour belongs to the experiment</w:t>
       </w:r>
@@ -14316,14 +14628,17 @@
         <w:jc w:val="both"/>
       </w:pPr>
       <w:r>
-        <w:t>Two of the three problems were specific to Windows. The operating system lets GPU memory be over-committed, so a memory probe cannot be trusted unless it keeps a safety margin; and PyTorch’s multi-process data loader slowly eats into the system commit charge until the process dies after a couple of hours. Neither is a bug in the algorithm, but both would have distorted the results had they gone unnoticed. The habits I took away are to record the environment explicitly in the report, to keep long runs resumable and to treat a sudden change in per-epoch time as something worth investigating.</w:t>
+        <w:t xml:space="preserve">Two of the three problems were specific to Windows. The operating system lets GPU memory be over-committed, so a memory probe cannot be trusted unless it </w:t>
+      </w:r>
+      <w:r>
+        <w:t>keeps a safety margin; and PyTorch’s multi-process data loader slowly eats into the system commit charge until the process dies after a couple of hours. Neither is a bug in the algorithm, but both would have distorted the results had they gone unnoticed. The habits I took away are to record the environment explicitly in the report, to keep long runs resumable and to treat a sudden change in per-epoch time as something worth investigating.</w:t>
       </w:r>
     </w:p>
     <w:p>
       <w:pPr>
         <w:pStyle w:val="2"/>
       </w:pPr>
-      <w:bookmarkStart w:id="34" w:name="_Toc242556176"/>
+      <w:bookmarkStart w:id="34" w:name="_Toc242557875"/>
       <w:r>
         <w:t>5.4 Reproducibility is a design decision taken in advance</w:t>
       </w:r>
@@ -14342,7 +14657,7 @@
       <w:pPr>
         <w:pStyle w:val="2"/>
       </w:pPr>
-      <w:bookmarkStart w:id="35" w:name="_Toc242556177"/>
+      <w:bookmarkStart w:id="35" w:name="_Toc242557876"/>
       <w:r>
         <w:t>5.5 How to prompt an AI agent effectively</w:t>
       </w:r>
@@ -14350,10 +14665,10 @@
     </w:p>
     <w:p>
       <w:pPr>
-        <w:pStyle w:val="ae"/>
+        <w:pStyle w:val="af"/>
         <w:numPr>
           <w:ilvl w:val="0"/>
-          <w:numId w:val="2"/>
+          <w:numId w:val="1"/>
         </w:numPr>
         <w:spacing w:after="60" w:line="264" w:lineRule="auto"/>
         <w:jc w:val="both"/>
@@ -14367,10 +14682,10 @@
     </w:p>
     <w:p>
       <w:pPr>
-        <w:pStyle w:val="ae"/>
+        <w:pStyle w:val="af"/>
         <w:numPr>
           <w:ilvl w:val="0"/>
-          <w:numId w:val="2"/>
+          <w:numId w:val="1"/>
         </w:numPr>
         <w:spacing w:after="60" w:line="264" w:lineRule="auto"/>
         <w:jc w:val="both"/>
@@ -14384,10 +14699,10 @@
     </w:p>
     <w:p>
       <w:pPr>
-        <w:pStyle w:val="ae"/>
+        <w:pStyle w:val="af"/>
         <w:numPr>
           <w:ilvl w:val="0"/>
-          <w:numId w:val="2"/>
+          <w:numId w:val="1"/>
         </w:numPr>
         <w:spacing w:after="60" w:line="264" w:lineRule="auto"/>
         <w:jc w:val="both"/>
@@ -14402,10 +14717,10 @@
     </w:p>
     <w:p>
       <w:pPr>
-        <w:pStyle w:val="ae"/>
+        <w:pStyle w:val="af"/>
         <w:numPr>
           <w:ilvl w:val="0"/>
-          <w:numId w:val="2"/>
+          <w:numId w:val="1"/>
         </w:numPr>
         <w:spacing w:after="60" w:line="264" w:lineRule="auto"/>
         <w:jc w:val="both"/>
@@ -14419,10 +14734,10 @@
     </w:p>
     <w:p>
       <w:pPr>
-        <w:pStyle w:val="ae"/>
+        <w:pStyle w:val="af"/>
         <w:numPr>
           <w:ilvl w:val="0"/>
-          <w:numId w:val="2"/>
+          <w:numId w:val="1"/>
         </w:numPr>
         <w:spacing w:after="60" w:line="264" w:lineRule="auto"/>
         <w:jc w:val="both"/>
@@ -14438,7 +14753,7 @@
       <w:pPr>
         <w:pStyle w:val="2"/>
       </w:pPr>
-      <w:bookmarkStart w:id="36" w:name="_Toc242556178"/>
+      <w:bookmarkStart w:id="36" w:name="_Toc242557877"/>
       <w:r>
         <w:t>5.6 What I would do differently next time</w:t>
       </w:r>
@@ -14446,10 +14761,10 @@
     </w:p>
     <w:p>
       <w:pPr>
-        <w:pStyle w:val="ae"/>
+        <w:pStyle w:val="af"/>
         <w:numPr>
           <w:ilvl w:val="0"/>
-          <w:numId w:val="2"/>
+          <w:numId w:val="1"/>
         </w:numPr>
         <w:spacing w:after="60" w:line="264" w:lineRule="auto"/>
         <w:jc w:val="both"/>
@@ -14460,10 +14775,10 @@
     </w:p>
     <w:p>
       <w:pPr>
-        <w:pStyle w:val="ae"/>
+        <w:pStyle w:val="af"/>
         <w:numPr>
           <w:ilvl w:val="0"/>
-          <w:numId w:val="2"/>
+          <w:numId w:val="1"/>
         </w:numPr>
         <w:spacing w:after="60" w:line="264" w:lineRule="auto"/>
         <w:jc w:val="both"/>
@@ -14474,10 +14789,10 @@
     </w:p>
     <w:p>
       <w:pPr>
-        <w:pStyle w:val="ae"/>
+        <w:pStyle w:val="af"/>
         <w:numPr>
           <w:ilvl w:val="0"/>
-          <w:numId w:val="2"/>
+          <w:numId w:val="1"/>
         </w:numPr>
         <w:spacing w:after="60" w:line="264" w:lineRule="auto"/>
         <w:jc w:val="both"/>
@@ -14488,10 +14803,10 @@
     </w:p>
     <w:p>
       <w:pPr>
-        <w:pStyle w:val="ae"/>
+        <w:pStyle w:val="af"/>
         <w:numPr>
           <w:ilvl w:val="0"/>
-          <w:numId w:val="2"/>
+          <w:numId w:val="1"/>
         </w:numPr>
         <w:spacing w:after="60" w:line="264" w:lineRule="auto"/>
         <w:jc w:val="both"/>
@@ -14505,7 +14820,7 @@
         <w:pStyle w:val="1"/>
         <w:pageBreakBefore/>
       </w:pPr>
-      <w:bookmarkStart w:id="37" w:name="_Toc242556179"/>
+      <w:bookmarkStart w:id="37" w:name="_Toc242557878"/>
       <w:r>
         <w:lastRenderedPageBreak/>
         <w:t>6. Source Code Webpage Link</w:t>
@@ -14526,14 +14841,14 @@
         <w:spacing w:before="120" w:after="120"/>
         <w:jc w:val="center"/>
       </w:pPr>
-      <w:r>
-        <w:rPr>
-          <w:b/>
-          <w:bCs/>
-          <w:color w:val="C00000"/>
-        </w:rPr>
-        <w:t>[ Repository URL — to be filled in by the author before submission, e.g. https://github.com/&lt;account&gt;/convnext-cifar10 ]</w:t>
-      </w:r>
+      <w:hyperlink r:id="rId11" w:tgtFrame="dsub" w:history="1">
+        <w:r>
+          <w:rPr>
+            <w:rStyle w:val="a6"/>
+          </w:rPr>
+          <w:t>https://github.com/umjohn123/convnext-cifar10</w:t>
+        </w:r>
+      </w:hyperlink>
     </w:p>
     <w:p>
       <w:pPr>
@@ -14544,14 +14859,20 @@
         <w:rPr>
           <w:bCs/>
         </w:rPr>
-        <w:t>A note on this item. The assignment requires an accessible web link, and the report is the only item that is submitted: the code, the data description, the experimental results and the AI dialogue records are supporting material, and all of it becomes available through that single link once the repository is published. Publishing the repository is the one step in the workflow the AI agent cannot carry out, so the link above is a placeholder that the author must replace before submission. The repository can be published without modification from the project structure described in Section 6.1.</w:t>
+        <w:t xml:space="preserve">A note on this item. The assignment requires an accessible web link, and the report is the only item </w:t>
+      </w:r>
+      <w:r>
+        <w:rPr>
+          <w:bCs/>
+        </w:rPr>
+        <w:t>that is submitted: the code, the data description, the experimental results and the AI dialogue records are supporting material, and all of it is available through the link above. The repository was published from the project structure described in Section 6.1 without modification. The raw CIFAR-10 archive and the model checkpoints are excluded from it for size, and both can be regenerated with the commands in Section 6.2.</w:t>
       </w:r>
     </w:p>
     <w:p>
       <w:pPr>
         <w:pStyle w:val="2"/>
       </w:pPr>
-      <w:bookmarkStart w:id="38" w:name="_Toc242556180"/>
+      <w:bookmarkStart w:id="38" w:name="_Toc242557879"/>
       <w:r>
         <w:t>6.1 What the repository contains</w:t>
       </w:r>
@@ -14559,10 +14880,10 @@
     </w:p>
     <w:p>
       <w:pPr>
-        <w:pStyle w:val="ae"/>
+        <w:pStyle w:val="af"/>
         <w:numPr>
           <w:ilvl w:val="0"/>
-          <w:numId w:val="2"/>
+          <w:numId w:val="1"/>
         </w:numPr>
         <w:spacing w:after="60" w:line="264" w:lineRule="auto"/>
         <w:jc w:val="both"/>
@@ -14573,10 +14894,10 @@
     </w:p>
     <w:p>
       <w:pPr>
-        <w:pStyle w:val="ae"/>
+        <w:pStyle w:val="af"/>
         <w:numPr>
           <w:ilvl w:val="0"/>
-          <w:numId w:val="2"/>
+          <w:numId w:val="1"/>
         </w:numPr>
         <w:spacing w:after="60" w:line="264" w:lineRule="auto"/>
         <w:jc w:val="both"/>
@@ -14587,10 +14908,10 @@
     </w:p>
     <w:p>
       <w:pPr>
-        <w:pStyle w:val="ae"/>
+        <w:pStyle w:val="af"/>
         <w:numPr>
           <w:ilvl w:val="0"/>
-          <w:numId w:val="2"/>
+          <w:numId w:val="1"/>
         </w:numPr>
         <w:spacing w:after="60" w:line="264" w:lineRule="auto"/>
         <w:jc w:val="both"/>
@@ -14601,10 +14922,10 @@
     </w:p>
     <w:p>
       <w:pPr>
-        <w:pStyle w:val="ae"/>
+        <w:pStyle w:val="af"/>
         <w:numPr>
           <w:ilvl w:val="0"/>
-          <w:numId w:val="2"/>
+          <w:numId w:val="1"/>
         </w:numPr>
         <w:spacing w:after="60" w:line="264" w:lineRule="auto"/>
         <w:jc w:val="both"/>
@@ -14615,10 +14936,10 @@
     </w:p>
     <w:p>
       <w:pPr>
-        <w:pStyle w:val="ae"/>
+        <w:pStyle w:val="af"/>
         <w:numPr>
           <w:ilvl w:val="0"/>
-          <w:numId w:val="2"/>
+          <w:numId w:val="1"/>
         </w:numPr>
         <w:spacing w:after="60" w:line="264" w:lineRule="auto"/>
         <w:jc w:val="both"/>
@@ -14643,14 +14964,22 @@
           <w:sz w:val="24"/>
           <w:szCs w:val="24"/>
         </w:rPr>
-        <w:t>These folders are supporting material: the report is the only item that is submitted, and everything listed here is reached through the repository link in Section 6.</w:t>
+        <w:t xml:space="preserve">These folders are supporting material: the report is the only item that </w:t>
+      </w:r>
+      <w:r>
+        <w:rPr>
+          <w:rFonts w:ascii="宋体" w:eastAsia="宋体" w:hAnsi="宋体"/>
+          <w:sz w:val="24"/>
+          <w:szCs w:val="24"/>
+        </w:rPr>
+        <w:t>is submitted, and everything listed here is reached through the repository link in Section 6.</w:t>
       </w:r>
     </w:p>
     <w:p>
       <w:pPr>
         <w:pStyle w:val="2"/>
       </w:pPr>
-      <w:bookmarkStart w:id="39" w:name="_Toc242556181"/>
+      <w:bookmarkStart w:id="39" w:name="_Toc242557880"/>
       <w:r>
         <w:t>6.2 How to run the code</w:t>
       </w:r>
@@ -14824,7 +15153,7 @@
         <w:pStyle w:val="1"/>
         <w:pageBreakBefore/>
       </w:pPr>
-      <w:bookmarkStart w:id="40" w:name="_Toc242556182"/>
+      <w:bookmarkStart w:id="40" w:name="_Toc242557881"/>
       <w:r>
         <w:lastRenderedPageBreak/>
         <w:t>References</w:t>
@@ -14833,10 +15162,10 @@
     </w:p>
     <w:p>
       <w:pPr>
-        <w:pStyle w:val="ae"/>
+        <w:pStyle w:val="af"/>
         <w:numPr>
           <w:ilvl w:val="0"/>
-          <w:numId w:val="1"/>
+          <w:numId w:val="2"/>
         </w:numPr>
         <w:spacing w:after="60" w:line="264" w:lineRule="auto"/>
         <w:jc w:val="both"/>
@@ -14847,10 +15176,10 @@
     </w:p>
     <w:p>
       <w:pPr>
-        <w:pStyle w:val="ae"/>
+        <w:pStyle w:val="af"/>
         <w:numPr>
           <w:ilvl w:val="0"/>
-          <w:numId w:val="1"/>
+          <w:numId w:val="2"/>
         </w:numPr>
         <w:spacing w:after="60" w:line="264" w:lineRule="auto"/>
         <w:jc w:val="both"/>
@@ -14861,10 +15190,10 @@
     </w:p>
     <w:p>
       <w:pPr>
-        <w:pStyle w:val="ae"/>
+        <w:pStyle w:val="af"/>
         <w:numPr>
           <w:ilvl w:val="0"/>
-          <w:numId w:val="1"/>
+          <w:numId w:val="2"/>
         </w:numPr>
         <w:spacing w:after="60" w:line="264" w:lineRule="auto"/>
         <w:jc w:val="both"/>
@@ -14875,10 +15204,10 @@
     </w:p>
     <w:p>
       <w:pPr>
-        <w:pStyle w:val="ae"/>
+        <w:pStyle w:val="af"/>
         <w:numPr>
           <w:ilvl w:val="0"/>
-          <w:numId w:val="1"/>
+          <w:numId w:val="2"/>
         </w:numPr>
         <w:spacing w:after="60" w:line="264" w:lineRule="auto"/>
         <w:jc w:val="both"/>
@@ -14889,10 +15218,10 @@
     </w:p>
     <w:p>
       <w:pPr>
-        <w:pStyle w:val="ae"/>
+        <w:pStyle w:val="af"/>
         <w:numPr>
           <w:ilvl w:val="0"/>
-          <w:numId w:val="1"/>
+          <w:numId w:val="2"/>
         </w:numPr>
         <w:spacing w:after="60" w:line="264" w:lineRule="auto"/>
         <w:jc w:val="both"/>
@@ -14903,10 +15232,10 @@
     </w:p>
     <w:p>
       <w:pPr>
-        <w:pStyle w:val="ae"/>
+        <w:pStyle w:val="af"/>
         <w:numPr>
           <w:ilvl w:val="0"/>
-          <w:numId w:val="1"/>
+          <w:numId w:val="2"/>
         </w:numPr>
         <w:spacing w:after="60" w:line="264" w:lineRule="auto"/>
         <w:jc w:val="both"/>
@@ -14917,10 +15246,10 @@
     </w:p>
     <w:p>
       <w:pPr>
-        <w:pStyle w:val="ae"/>
+        <w:pStyle w:val="af"/>
         <w:numPr>
           <w:ilvl w:val="0"/>
-          <w:numId w:val="1"/>
+          <w:numId w:val="2"/>
         </w:numPr>
         <w:spacing w:after="60" w:line="264" w:lineRule="auto"/>
         <w:jc w:val="both"/>
@@ -14931,22 +15260,25 @@
     </w:p>
     <w:p>
       <w:pPr>
-        <w:pStyle w:val="ae"/>
+        <w:pStyle w:val="af"/>
         <w:numPr>
           <w:ilvl w:val="0"/>
-          <w:numId w:val="1"/>
+          <w:numId w:val="2"/>
         </w:numPr>
         <w:spacing w:after="60" w:line="264" w:lineRule="auto"/>
         <w:jc w:val="both"/>
       </w:pPr>
       <w:r>
-        <w:t>PyTorch documentation — automatic mixed precision and CUDA memory management: https://docs.pytorch.org/docs/stable/notes/cuda.html</w:t>
+        <w:t xml:space="preserve">PyTorch </w:t>
+      </w:r>
+      <w:r>
+        <w:t>documentation — automatic mixed precision and CUDA memory management: https://docs.pytorch.org/docs/stable/notes/cuda.html</w:t>
       </w:r>
     </w:p>
     <w:p/>
     <w:sectPr>
-      <w:headerReference w:type="default" r:id="rId11"/>
-      <w:footerReference w:type="default" r:id="rId12"/>
+      <w:headerReference w:type="default" r:id="rId12"/>
+      <w:footerReference w:type="default" r:id="rId13"/>
       <w:pgSz w:w="12240" w:h="15840"/>
       <w:pgMar w:top="1440" w:right="1440" w:bottom="1440" w:left="1440" w:header="708" w:footer="708" w:gutter="0"/>
       <w:cols w:space="720"/>
@@ -15180,17 +15512,17 @@
       <w:lvlText w:val=""/>
       <w:lvlJc w:val="left"/>
     </w:lvl>
-    <w:lvl w:ilvl="6" w:tplc="95B27B9A">
+    <w:lvl w:ilvl="6" w:tplc="891EEE10">
       <w:numFmt w:val="decimal"/>
       <w:lvlText w:val=""/>
       <w:lvlJc w:val="left"/>
     </w:lvl>
-    <w:lvl w:ilvl="7" w:tplc="599AF728">
+    <w:lvl w:ilvl="7" w:tplc="855A7738">
       <w:numFmt w:val="decimal"/>
       <w:lvlText w:val=""/>
       <w:lvlJc w:val="left"/>
     </w:lvl>
-    <w:lvl w:ilvl="8" w:tplc="5D4EF236">
+    <w:lvl w:ilvl="8" w:tplc="0BE6FBE6">
       <w:numFmt w:val="decimal"/>
       <w:lvlText w:val=""/>
       <w:lvlJc w:val="left"/>
@@ -15214,27 +15546,27 @@
       <w:lvlText w:val=""/>
       <w:lvlJc w:val="left"/>
     </w:lvl>
-    <w:lvl w:ilvl="2" w:tplc="9830E802">
+    <w:lvl w:ilvl="2" w:tplc="FFFFFFFF">
       <w:numFmt w:val="decimal"/>
       <w:lvlText w:val=""/>
       <w:lvlJc w:val="left"/>
     </w:lvl>
-    <w:lvl w:ilvl="3" w:tplc="55A04D4A">
+    <w:lvl w:ilvl="3" w:tplc="FFFFFFFF">
       <w:numFmt w:val="decimal"/>
       <w:lvlText w:val=""/>
       <w:lvlJc w:val="left"/>
     </w:lvl>
-    <w:lvl w:ilvl="4" w:tplc="911AFFDA">
+    <w:lvl w:ilvl="4" w:tplc="FFFFFFFF">
       <w:numFmt w:val="decimal"/>
       <w:lvlText w:val=""/>
       <w:lvlJc w:val="left"/>
     </w:lvl>
-    <w:lvl w:ilvl="5" w:tplc="0E4A7164">
+    <w:lvl w:ilvl="5" w:tplc="FFFFFFFF">
       <w:numFmt w:val="decimal"/>
       <w:lvlText w:val=""/>
       <w:lvlJc w:val="left"/>
     </w:lvl>
-    <w:lvl w:ilvl="6" w:tplc="71FC65CA">
+    <w:lvl w:ilvl="6" w:tplc="FFFFFFFF">
       <w:numFmt w:val="decimal"/>
       <w:lvlText w:val=""/>
       <w:lvlJc w:val="left"/>
@@ -15244,20 +15576,20 @@
       <w:lvlText w:val=""/>
       <w:lvlJc w:val="left"/>
     </w:lvl>
-    <w:lvl w:ilvl="8" w:tplc="6250162C">
+    <w:lvl w:ilvl="8" w:tplc="A60237AC">
       <w:numFmt w:val="decimal"/>
       <w:lvlText w:val=""/>
       <w:lvlJc w:val="left"/>
     </w:lvl>
   </w:abstractNum>
-  <w:num w:numId="1" w16cid:durableId="1570387029">
-    <w:abstractNumId w:val="0"/>
+  <w:num w:numId="1" w16cid:durableId="841165751">
+    <w:abstractNumId w:val="1"/>
     <w:lvlOverride w:ilvl="0">
       <w:startOverride w:val="1"/>
     </w:lvlOverride>
   </w:num>
-  <w:num w:numId="2" w16cid:durableId="213391813">
-    <w:abstractNumId w:val="1"/>
+  <w:num w:numId="2" w16cid:durableId="1651136033">
+    <w:abstractNumId w:val="0"/>
     <w:lvlOverride w:ilvl="0">
       <w:startOverride w:val="1"/>
     </w:lvlOverride>
@@ -15793,38 +16125,47 @@
     <w:unhideWhenUsed/>
   </w:style>
   <w:style w:type="paragraph" w:styleId="a3">
-    <w:name w:val="footer"/>
+    <w:name w:val="footnote text"/>
     <w:basedOn w:val="a"/>
     <w:link w:val="a4"/>
     <w:uiPriority w:val="99"/>
+    <w:semiHidden/>
     <w:unhideWhenUsed/>
-    <w:rsid w:val="001E5791"/>
-    <w:pPr>
-      <w:tabs>
-        <w:tab w:val="center" w:pos="4153"/>
-        <w:tab w:val="right" w:pos="8306"/>
-      </w:tabs>
-      <w:snapToGrid w:val="0"/>
-    </w:pPr>
     <w:rPr>
-      <w:sz w:val="18"/>
-      <w:szCs w:val="18"/>
+      <w:sz w:val="20"/>
+      <w:szCs w:val="20"/>
     </w:rPr>
   </w:style>
-  <w:style w:type="character" w:customStyle="1" w:styleId="a5">
-    <w:name w:val="页眉 字符"/>
-    <w:basedOn w:val="a0"/>
-    <w:link w:val="a6"/>
+  <w:style w:type="character" w:styleId="a5">
+    <w:name w:val="footnote reference"/>
     <w:uiPriority w:val="99"/>
-    <w:rsid w:val="001E5791"/>
+    <w:semiHidden/>
+    <w:unhideWhenUsed/>
     <w:rPr>
-      <w:sz w:val="18"/>
-      <w:szCs w:val="18"/>
+      <w:vertAlign w:val="superscript"/>
     </w:rPr>
   </w:style>
-  <w:style w:type="paragraph" w:styleId="a7">
-    <w:name w:val="endnote text"/>
+  <w:style w:type="paragraph" w:customStyle="1" w:styleId="10">
+    <w:name w:val="要点1"/>
     <w:basedOn w:val="a"/>
+    <w:next w:val="a"/>
+    <w:qFormat/>
+    <w:rPr>
+      <w:b/>
+      <w:bCs/>
+    </w:rPr>
+  </w:style>
+  <w:style w:type="character" w:styleId="a6">
+    <w:name w:val="Hyperlink"/>
+    <w:uiPriority w:val="99"/>
+    <w:unhideWhenUsed/>
+    <w:rPr>
+      <w:color w:val="0563C1"/>
+      <w:u w:val="single"/>
+    </w:rPr>
+  </w:style>
+  <w:style w:type="character" w:customStyle="1" w:styleId="a7">
+    <w:name w:val="尾注文本 字符"/>
     <w:link w:val="a8"/>
     <w:uiPriority w:val="99"/>
     <w:semiHidden/>
@@ -15834,10 +16175,10 @@
       <w:szCs w:val="20"/>
     </w:rPr>
   </w:style>
-  <w:style w:type="character" w:customStyle="1" w:styleId="a4">
-    <w:name w:val="页脚 字符"/>
+  <w:style w:type="character" w:customStyle="1" w:styleId="a9">
+    <w:name w:val="页眉 字符"/>
     <w:basedOn w:val="a0"/>
-    <w:link w:val="a3"/>
+    <w:link w:val="aa"/>
     <w:uiPriority w:val="99"/>
     <w:rsid w:val="001E5791"/>
     <w:rPr>
@@ -15845,33 +16186,30 @@
       <w:szCs w:val="18"/>
     </w:rPr>
   </w:style>
-  <w:style w:type="paragraph" w:styleId="a9">
-    <w:name w:val="Title"/>
-    <w:basedOn w:val="a"/>
-    <w:next w:val="a"/>
-    <w:uiPriority w:val="10"/>
-    <w:qFormat/>
+  <w:style w:type="character" w:customStyle="1" w:styleId="ab">
+    <w:name w:val="页脚 字符"/>
+    <w:basedOn w:val="a0"/>
+    <w:link w:val="ac"/>
+    <w:uiPriority w:val="99"/>
+    <w:rsid w:val="001E5791"/>
     <w:rPr>
-      <w:sz w:val="56"/>
-      <w:szCs w:val="56"/>
+      <w:sz w:val="18"/>
+      <w:szCs w:val="18"/>
     </w:rPr>
   </w:style>
-  <w:style w:type="paragraph" w:styleId="aa">
-    <w:name w:val="footnote text"/>
-    <w:basedOn w:val="a"/>
-    <w:link w:val="ab"/>
+  <w:style w:type="character" w:styleId="ad">
+    <w:name w:val="endnote reference"/>
     <w:uiPriority w:val="99"/>
     <w:semiHidden/>
     <w:unhideWhenUsed/>
     <w:rPr>
-      <w:sz w:val="20"/>
-      <w:szCs w:val="20"/>
+      <w:vertAlign w:val="superscript"/>
     </w:rPr>
   </w:style>
-  <w:style w:type="paragraph" w:styleId="a6">
+  <w:style w:type="paragraph" w:styleId="aa">
     <w:name w:val="header"/>
     <w:basedOn w:val="a"/>
-    <w:link w:val="a5"/>
+    <w:link w:val="a9"/>
     <w:uiPriority w:val="99"/>
     <w:unhideWhenUsed/>
     <w:rsid w:val="001E5791"/>
@@ -15888,6 +16226,17 @@
       <w:szCs w:val="18"/>
     </w:rPr>
   </w:style>
+  <w:style w:type="paragraph" w:styleId="ae">
+    <w:name w:val="Title"/>
+    <w:basedOn w:val="a"/>
+    <w:next w:val="a"/>
+    <w:uiPriority w:val="10"/>
+    <w:qFormat/>
+    <w:rPr>
+      <w:sz w:val="56"/>
+      <w:szCs w:val="56"/>
+    </w:rPr>
+  </w:style>
   <w:style w:type="paragraph" w:styleId="TOC2">
     <w:name w:val="toc 2"/>
     <w:basedOn w:val="a"/>
@@ -15900,19 +16249,28 @@
       <w:ind w:leftChars="200" w:left="420"/>
     </w:pPr>
   </w:style>
-  <w:style w:type="paragraph" w:customStyle="1" w:styleId="10">
-    <w:name w:val="要点1"/>
+  <w:style w:type="paragraph" w:styleId="ac">
+    <w:name w:val="footer"/>
     <w:basedOn w:val="a"/>
-    <w:next w:val="a"/>
-    <w:qFormat/>
+    <w:link w:val="ab"/>
+    <w:uiPriority w:val="99"/>
+    <w:unhideWhenUsed/>
+    <w:rsid w:val="001E5791"/>
+    <w:pPr>
+      <w:tabs>
+        <w:tab w:val="center" w:pos="4153"/>
+        <w:tab w:val="right" w:pos="8306"/>
+      </w:tabs>
+      <w:snapToGrid w:val="0"/>
+    </w:pPr>
     <w:rPr>
-      <w:b/>
-      <w:bCs/>
+      <w:sz w:val="18"/>
+      <w:szCs w:val="18"/>
     </w:rPr>
   </w:style>
-  <w:style w:type="character" w:customStyle="1" w:styleId="ab">
+  <w:style w:type="character" w:customStyle="1" w:styleId="a4">
     <w:name w:val="脚注文本 字符"/>
-    <w:link w:val="aa"/>
+    <w:link w:val="a3"/>
     <w:uiPriority w:val="99"/>
     <w:semiHidden/>
     <w:unhideWhenUsed/>
@@ -15921,25 +16279,10 @@
       <w:szCs w:val="20"/>
     </w:rPr>
   </w:style>
-  <w:style w:type="character" w:styleId="ac">
-    <w:name w:val="footnote reference"/>
-    <w:uiPriority w:val="99"/>
-    <w:semiHidden/>
-    <w:unhideWhenUsed/>
-    <w:rPr>
-      <w:vertAlign w:val="superscript"/>
-    </w:rPr>
-  </w:style>
-  <w:style w:type="character" w:customStyle="1" w:styleId="a8">
-    <w:name w:val="尾注文本 字符"/>
-    <w:link w:val="a7"/>
-    <w:uiPriority w:val="99"/>
-    <w:semiHidden/>
-    <w:unhideWhenUsed/>
-    <w:rPr>
-      <w:sz w:val="20"/>
-      <w:szCs w:val="20"/>
-    </w:rPr>
+  <w:style w:type="paragraph" w:styleId="af">
+    <w:name w:val="List Paragraph"/>
+    <w:basedOn w:val="a"/>
+    <w:qFormat/>
   </w:style>
   <w:style w:type="paragraph" w:styleId="TOC1">
     <w:name w:val="toc 1"/>
@@ -15950,27 +16293,16 @@
     <w:unhideWhenUsed/>
     <w:rsid w:val="001E5791"/>
   </w:style>
-  <w:style w:type="character" w:styleId="ad">
-    <w:name w:val="endnote reference"/>
+  <w:style w:type="paragraph" w:styleId="a8">
+    <w:name w:val="endnote text"/>
+    <w:basedOn w:val="a"/>
+    <w:link w:val="a7"/>
     <w:uiPriority w:val="99"/>
     <w:semiHidden/>
     <w:unhideWhenUsed/>
     <w:rPr>
-      <w:vertAlign w:val="superscript"/>
-    </w:rPr>
-  </w:style>
-  <w:style w:type="paragraph" w:styleId="ae">
-    <w:name w:val="List Paragraph"/>
-    <w:basedOn w:val="a"/>
-    <w:qFormat/>
-  </w:style>
-  <w:style w:type="character" w:styleId="af">
-    <w:name w:val="Hyperlink"/>
-    <w:uiPriority w:val="99"/>
-    <w:unhideWhenUsed/>
-    <w:rPr>
-      <w:color w:val="0563C1"/>
-      <w:u w:val="single"/>
+      <w:sz w:val="20"/>
+      <w:szCs w:val="20"/>
     </w:rPr>
   </w:style>
 </w:styles>

</xml_diff>